<commit_message>
feat: add Vietnamese-English localization and update project documentation
</commit_message>
<xml_diff>
--- a/BaoCao_GiuaKy_PokemonMemoryBattle.docx
+++ b/BaoCao_GiuaKy_PokemonMemoryBattle.docx
@@ -16,18 +16,20 @@
       <w:r>
         <w:t>Lập trình trên Windows 2611COMP101901</w:t>
         <w:br/>
+        <w:t>Nhóm AltF4</w:t>
+        <w:br/>
         <w:t>Ngày 27 tháng 10 năm 2026</w:t>
       </w:r>
     </w:p>
     <w:p>
       <w:r>
-        <w:t>Nhóm [TÊN NHÓM]</w:t>
+        <w:t>Dương Đình Khôi — 51.01.104.049</w:t>
         <w:br/>
-        <w:t>[HỌ TÊN 1] • [MSSV 1] • [LỚP 1]</w:t>
+        <w:t>Đào Trọng Quyền — 51.01.104.085</w:t>
         <w:br/>
-        <w:t>[HỌ TÊN 2] • [MSSV 2] • [LỚP 2]</w:t>
+        <w:t>Cổ Gia Phúc — 51.01.104.126</w:t>
         <w:br/>
-        <w:t>[HỌ TÊN 3] • [MSSV 3] • [LỚP 3]</w:t>
+        <w:t>Lớp chưa được cung cấp trong tài liệu.</w:t>
       </w:r>
     </w:p>
     <w:p>
@@ -35,12 +37,12 @@
         <w:pStyle w:val="Heading2"/>
       </w:pPr>
       <w:r>
-        <w:t>Phạm vi báo cáo</w:t>
-      </w:r>
-    </w:p>
-    <w:p>
-      <w:r>
-        <w:t>Báo cáo mô tả ứng dụng đã triển khai, kiến trúc, mã cốt lõi và kiểm thử. Bản Release build thành công với 0 lỗi, 0 cảnh báo; 43 kiểm tra thực thi PASS. Nhóm cần hoàn thiện thông tin thật, video thuyết minh và xác nhận nộp link.</w:t>
+        <w:t>Phạm vi cập nhật</w:t>
+      </w:r>
+    </w:p>
+    <w:p>
+      <w:r>
+        <w:t>Báo cáo cập nhật sản phẩm hiện có với Tiếng Việt mặc định, tùy chọn English, đổi ngay và lưu lựa chọn theo người dùng. Bản build thành công, 62 kiểm tra PASS gồm 15 ca đa ngôn ngữ. Phân công cá nhân là dự kiến. Cần hoàn thiện lớp, video có thuyết minh và xác nhận nộp link.</w:t>
       </w:r>
     </w:p>
     <w:p>
@@ -112,7 +114,7 @@
         <w:rPr>
           <w:b w:val="0"/>
         </w:rPr>
-        <w:t>Pokémon Memory Battle là trò chơi ghép cặp thẻ cho học phần Lập trình trên Windows 2611COMP101901. Sản phẩm thể hiện xử lý sự kiện, sinh giao diện động, quản lý trạng thái, Timer, SoundPlayer và lưu thành tích bằng System.IO. Bản Release biên dịch thành công với 0 lỗi, 0 cảnh báo; 43 phép kiểm tra đã chạy trên Windows, gồm form thật và Timer thật.</w:t>
+        <w:t>Pokémon Memory Battle là trò chơi ghép cặp thẻ cho học phần Lập trình trên Windows 2611COMP101901. Sản phẩm thể hiện xử lý sự kiện, sinh giao diện động, quản lý trạng thái, Timer, SoundPlayer và lưu thành tích bằng System.IO. Bản Release biên dịch thành công với 0 lỗi, 0 cảnh báo; 62 phép kiểm tra đã chạy trên Windows, gồm form thật và Timer thật.</w:t>
       </w:r>
     </w:p>
     <w:p>
@@ -152,7 +154,7 @@
         <w:rPr>
           <w:b w:val="0"/>
         </w:rPr>
-        <w:t>Phạm vi gồm một người chơi offline, ba độ khó, tính điểm, đếm ngược, pause/resume, restart, âm thanh, nhập tên và bảng xếp hạng. Không có tài khoản mạng, cơ sở dữ liệu, chiến đấu Pokémon hay chống sửa điểm. Ba thành viên cần điền thông tin thật và nhận bàn giao code trước khi trình bày.</w:t>
+        <w:t>Phạm vi gồm một người chơi offline, ba độ khó, tính điểm, đếm ngược, pause/resume, restart, âm thanh, nhập tên và bảng xếp hạng. Không có tài khoản mạng, cơ sở dữ liệu, chiến đấu Pokémon hay chống sửa điểm. Ba thành viên đã có tên/MSSV chính xác; cần bổ sung lớp và nhận bàn giao code trước khi trình bày.</w:t>
       </w:r>
     </w:p>
     <w:p>
@@ -237,7 +239,7 @@
         <w:rPr>
           <w:b w:val="0"/>
         </w:rPr>
-        <w:t>Nhãn 7.0 điểm ở phần gameplay không khớp tổng mục con; giữ mọi tiêu chí, không tự sửa thang điểm. Không suy ra tên nhóm/khung giờ từ số ba người. Hạn nộp link là 23h59 ngày 27/10/2026; buổi báo cáo từ 20h00 ngày 29/10/2026; đến sớm ít nhất 10 phút. Thông tin thật, video thuyết minh, nộp cột Giữa kì và vấn đáp chưa được coi là đã hoàn thành.</w:t>
+        <w:t>Nhãn 7.0 điểm ở phần gameplay không khớp tổng mục con; giữ mọi tiêu chí, không tự sửa thang điểm. Theo đúng ba tên/MSSV, AltF4 có khung 21:10–21:20; không suy ra nhóm chỉ từ số người. Hạn nộp link là 23h59 ngày 27/10/2026; buổi báo cáo từ 20h00 ngày 29/10/2026; đến sớm ít nhất 10 phút. Lớp, video thuyết minh, xác nhận nộp cột Giữa kì và vấn đáp vẫn chưa hoàn thành.</w:t>
       </w:r>
     </w:p>
     <w:p>
@@ -329,7 +331,7 @@
       <w:r>
         <w:drawing>
           <wp:inline xmlns:a="http://schemas.openxmlformats.org/drawingml/2006/main" xmlns:pic="http://schemas.openxmlformats.org/drawingml/2006/picture">
-            <wp:extent cx="5852160" cy="3826412"/>
+            <wp:extent cx="5852160" cy="4002087"/>
             <wp:docPr id="1" name="Picture 1"/>
             <wp:cNvGraphicFramePr>
               <a:graphicFrameLocks noChangeAspect="1"/>
@@ -338,11 +340,11 @@
               <a:graphicData uri="http://schemas.openxmlformats.org/drawingml/2006/picture">
                 <pic:pic>
                   <pic:nvPicPr>
-                    <pic:cNvPr id="0" name="gameplay.png"/>
+                    <pic:cNvPr id="0" name="gameplay-vi-VN.png"/>
                     <pic:cNvPicPr/>
                   </pic:nvPicPr>
                   <pic:blipFill>
-                    <a:blip r:embed="rId9"/>
+                    <a:blip r:embed="rId11"/>
                     <a:stretch>
                       <a:fillRect/>
                     </a:stretch>
@@ -350,7 +352,7 @@
                   <pic:spPr>
                     <a:xfrm>
                       <a:off x="0" y="0"/>
-                      <a:ext cx="5852160" cy="3826412"/>
+                      <a:ext cx="5852160" cy="4002087"/>
                     </a:xfrm>
                     <a:prstGeom prst="rect"/>
                   </pic:spPr>
@@ -719,15 +721,7 @@
         <w:pStyle w:val="Heading2"/>
       </w:pPr>
       <w:r>
-        <w:t>Trích đoạn từ source triển khai</w:t>
-      </w:r>
-    </w:p>
-    <w:p>
-      <w:pPr>
-        <w:pStyle w:val="Heading3"/>
-      </w:pPr>
-      <w:r>
-        <w:t>Program.cs</w:t>
+        <w:t>Chức năng đa ngôn ngữ (Tiếng Việt và Tiếng Anh)</w:t>
       </w:r>
     </w:p>
     <w:p>
@@ -735,111 +729,7 @@
         <w:rPr>
           <w:b w:val="0"/>
         </w:rPr>
-        <w:t>Nguồn src/Program.cs</w:t>
-      </w:r>
-    </w:p>
-    <w:p>
-      <w:pPr>
-        <w:pStyle w:val="Code"/>
-      </w:pPr>
-      <w:r>
-        <w:t xml:space="preserve">    [STAThread]</w:t>
-      </w:r>
-    </w:p>
-    <w:p>
-      <w:pPr>
-        <w:pStyle w:val="Code"/>
-      </w:pPr>
-      <w:r>
-        <w:t xml:space="preserve">    static void Main(string[] args)</w:t>
-      </w:r>
-    </w:p>
-    <w:p>
-      <w:pPr>
-        <w:pStyle w:val="Code"/>
-      </w:pPr>
-      <w:r>
-        <w:t xml:space="preserve">    {</w:t>
-      </w:r>
-    </w:p>
-    <w:p>
-      <w:pPr>
-        <w:pStyle w:val="Code"/>
-      </w:pPr>
-      <w:r>
-        <w:t xml:space="preserve">        ApplicationConfiguration.Initialize();</w:t>
-      </w:r>
-    </w:p>
-    <w:p>
-      <w:pPr>
-        <w:pStyle w:val="Code"/>
-      </w:pPr>
-      <w:r>
-        <w:t xml:space="preserve">        if (args.Contains("--self-test"))</w:t>
-      </w:r>
-    </w:p>
-    <w:p>
-      <w:pPr>
-        <w:pStyle w:val="Code"/>
-      </w:pPr>
-      <w:r>
-        <w:t xml:space="preserve">        {</w:t>
-      </w:r>
-    </w:p>
-    <w:p>
-      <w:pPr>
-        <w:pStyle w:val="Code"/>
-      </w:pPr>
-      <w:r>
-        <w:t xml:space="preserve">            SelfTests.Run();</w:t>
-      </w:r>
-    </w:p>
-    <w:p>
-      <w:pPr>
-        <w:pStyle w:val="Code"/>
-      </w:pPr>
-      <w:r>
-        <w:t xml:space="preserve">            return;</w:t>
-      </w:r>
-    </w:p>
-    <w:p>
-      <w:pPr>
-        <w:pStyle w:val="Code"/>
-      </w:pPr>
-      <w:r>
-        <w:t xml:space="preserve">        }</w:t>
-      </w:r>
-    </w:p>
-    <w:p>
-      <w:pPr>
-        <w:pStyle w:val="Code"/>
-      </w:pPr>
-      <w:r>
-        <w:t xml:space="preserve">        Application.Run(new MainMenuForm());</w:t>
-      </w:r>
-    </w:p>
-    <w:p>
-      <w:pPr>
-        <w:pStyle w:val="Code"/>
-      </w:pPr>
-      <w:r>
-        <w:t xml:space="preserve">    }</w:t>
-      </w:r>
-    </w:p>
-    <w:p>
-      <w:pPr>
-        <w:pStyle w:val="Code"/>
-      </w:pPr>
-      <w:r>
-        <w:t>}</w:t>
-      </w:r>
-    </w:p>
-    <w:p>
-      <w:pPr>
-        <w:pStyle w:val="Heading3"/>
-      </w:pPr>
-      <w:r>
-        <w:t>Sinh thẻ động</w:t>
+        <w:t>Hai ngôn ngữ giúp nhóm trình bày bằng Tiếng Việt và phục vụ người dùng English. Lần đầu dùng vi-VN. LocalizationManager đọc src/Resources/Strings.vi-VN.json và Strings.en-US.json nhúng vào assembly; mỗi tệp có 94 khóa đồng nhất. Đây là hệ thống tập trung thay cho resx. GameManager, mã độ khó và schema file không đổi theo ngôn ngữ.</w:t>
       </w:r>
     </w:p>
     <w:p>
@@ -847,95 +737,7 @@
         <w:rPr>
           <w:b w:val="0"/>
         </w:rPr>
-        <w:t>Nguồn src/Forms/GameForm.cs</w:t>
-      </w:r>
-    </w:p>
-    <w:p>
-      <w:pPr>
-        <w:pStyle w:val="Code"/>
-      </w:pPr>
-      <w:r>
-        <w:t xml:space="preserve">        var back = resources.LoadImage("bg/no-image.png");</w:t>
-      </w:r>
-    </w:p>
-    <w:p>
-      <w:pPr>
-        <w:pStyle w:val="Code"/>
-      </w:pPr>
-      <w:r>
-        <w:t xml:space="preserve">        for (int i = 0; i &lt; Game.Cards.Count; i++)</w:t>
-      </w:r>
-    </w:p>
-    <w:p>
-      <w:pPr>
-        <w:pStyle w:val="Code"/>
-      </w:pPr>
-      <w:r>
-        <w:t xml:space="preserve">        {</w:t>
-      </w:r>
-    </w:p>
-    <w:p>
-      <w:pPr>
-        <w:pStyle w:val="Code"/>
-      </w:pPr>
-      <w:r>
-        <w:t xml:space="preserve">            int index = i;</w:t>
-      </w:r>
-    </w:p>
-    <w:p>
-      <w:pPr>
-        <w:pStyle w:val="Code"/>
-      </w:pPr>
-      <w:r>
-        <w:t xml:space="preserve">            var card = new MemoryCardControl(Game.Cards[i], </w:t>
-      </w:r>
-    </w:p>
-    <w:p>
-      <w:pPr>
-        <w:pStyle w:val="Code"/>
-      </w:pPr>
-      <w:r>
-        <w:t>resources.LoadImage($"img/{Game.Cards[i].Creature}.png"), back);</w:t>
-      </w:r>
-    </w:p>
-    <w:p>
-      <w:pPr>
-        <w:pStyle w:val="Code"/>
-      </w:pPr>
-      <w:r>
-        <w:t xml:space="preserve">            card.Click += (_, _) =&gt; SelectCard(index);</w:t>
-      </w:r>
-    </w:p>
-    <w:p>
-      <w:pPr>
-        <w:pStyle w:val="Code"/>
-      </w:pPr>
-      <w:r>
-        <w:t xml:space="preserve">            CardControls.Add(card);</w:t>
-      </w:r>
-    </w:p>
-    <w:p>
-      <w:pPr>
-        <w:pStyle w:val="Code"/>
-      </w:pPr>
-      <w:r>
-        <w:t xml:space="preserve">            grid.Controls.Add(card, i % difficulty.Columns, i / difficulty.Columns);</w:t>
-      </w:r>
-    </w:p>
-    <w:p>
-      <w:pPr>
-        <w:pStyle w:val="Code"/>
-      </w:pPr>
-      <w:r>
-        <w:t xml:space="preserve">        }</w:t>
-      </w:r>
-    </w:p>
-    <w:p>
-      <w:pPr>
-        <w:pStyle w:val="Heading3"/>
-      </w:pPr>
-      <w:r>
-        <w:t>Fisher Yates</w:t>
+        <w:t>SetLanguage đổi CurrentCulture/CurrentUICulture rồi phát LanguageChanged. LocalizedForm gọi ApplyLocalization để cập nhật tiêu đề, text, accessible name và tooltip; Dispose gỡ đăng ký để không giữ form cũ. Các form con cập nhật HUD, thẻ, cột/giá trị bảng điểm và trạng thái nút. GameForm.ApplyLocalization không gọi ResetGame và không thay Stopwatch/CardModel. Đồng hồ vẫn chạy trong Cài đặt; người chơi có thể Tạm dừng trước.</w:t>
       </w:r>
     </w:p>
     <w:p>
@@ -943,55 +745,7 @@
         <w:rPr>
           <w:b w:val="0"/>
         </w:rPr>
-        <w:t>Nguồn src/GameLogic/GameManager.cs</w:t>
-      </w:r>
-    </w:p>
-    <w:p>
-      <w:pPr>
-        <w:pStyle w:val="Code"/>
-      </w:pPr>
-      <w:r>
-        <w:t xml:space="preserve">        for (int i = Cards.Count - 1; i &gt; 0; i--)</w:t>
-      </w:r>
-    </w:p>
-    <w:p>
-      <w:pPr>
-        <w:pStyle w:val="Code"/>
-      </w:pPr>
-      <w:r>
-        <w:t xml:space="preserve">        {</w:t>
-      </w:r>
-    </w:p>
-    <w:p>
-      <w:pPr>
-        <w:pStyle w:val="Code"/>
-      </w:pPr>
-      <w:r>
-        <w:t xml:space="preserve">            int j = random.Next(i + 1);</w:t>
-      </w:r>
-    </w:p>
-    <w:p>
-      <w:pPr>
-        <w:pStyle w:val="Code"/>
-      </w:pPr>
-      <w:r>
-        <w:t xml:space="preserve">            (Cards[i], Cards[j]) = (Cards[j], Cards[i]);</w:t>
-      </w:r>
-    </w:p>
-    <w:p>
-      <w:pPr>
-        <w:pStyle w:val="Code"/>
-      </w:pPr>
-      <w:r>
-        <w:t xml:space="preserve">        }</w:t>
-      </w:r>
-    </w:p>
-    <w:p>
-      <w:pPr>
-        <w:pStyle w:val="Heading3"/>
-      </w:pPr>
-      <w:r>
-        <w:t>Khóa và so khớp</w:t>
+        <w:t>SettingsForm dùng SelectedIndexChanged, SetLanguage và SaveLanguagePreference. Cấu hình ở %LOCALAPPDATA%/PokemonMemoryBattle/settings.json; không ghi vào thư mục cài đặt. Ghi qua tệp tạm rồi File.Move thay thế. Thiếu tệp, JSON hỏng/sai kiểu, ngôn ngữ không hỗ trợ hoặc lỗi quyền đọc dùng Tiếng Việt. Ghi thất bại trả false, báo cảnh báo theo tiếng đã chọn và giữ lựa chọn trong phiên. GetString chuẩn hóa CRLF để TextBox nhiều dòng hiển thị đúng đoạn văn.</w:t>
       </w:r>
     </w:p>
     <w:p>
@@ -999,263 +753,15 @@
         <w:rPr>
           <w:b w:val="0"/>
         </w:rPr>
-        <w:t>Nguồn src/GameLogic/GameManager.cs</w:t>
-      </w:r>
-    </w:p>
-    <w:p>
-      <w:pPr>
-        <w:pStyle w:val="Code"/>
-      </w:pPr>
-      <w:r>
-        <w:t xml:space="preserve">    public bool? Select(int index)</w:t>
-      </w:r>
-    </w:p>
-    <w:p>
-      <w:pPr>
-        <w:pStyle w:val="Code"/>
-      </w:pPr>
-      <w:r>
-        <w:t xml:space="preserve">    {</w:t>
-      </w:r>
-    </w:p>
-    <w:p>
-      <w:pPr>
-        <w:pStyle w:val="Code"/>
-      </w:pPr>
-      <w:r>
-        <w:t xml:space="preserve">        if (State != GameState.Playing || InputLocked || index &lt; 0 || index &gt;= Cards.Count)</w:t>
-      </w:r>
-    </w:p>
-    <w:p>
-      <w:pPr>
-        <w:pStyle w:val="Code"/>
-      </w:pPr>
-      <w:r>
-        <w:t xml:space="preserve">            return null;</w:t>
-      </w:r>
-    </w:p>
-    <w:p>
-      <w:pPr>
-        <w:pStyle w:val="Code"/>
-      </w:pPr>
-      <w:r>
-        <w:t xml:space="preserve">        var card = Cards[index];</w:t>
-      </w:r>
-    </w:p>
-    <w:p>
-      <w:pPr>
-        <w:pStyle w:val="Code"/>
-      </w:pPr>
-      <w:r>
-        <w:t xml:space="preserve">        if (card.Revealed || card.Matched)</w:t>
-      </w:r>
-    </w:p>
-    <w:p>
-      <w:pPr>
-        <w:pStyle w:val="Code"/>
-      </w:pPr>
-      <w:r>
-        <w:t xml:space="preserve">            return null;</w:t>
-      </w:r>
-    </w:p>
-    <w:p>
-      <w:pPr>
-        <w:pStyle w:val="Code"/>
-      </w:pPr>
-      <w:r>
-        <w:t xml:space="preserve">        card.Revealed = true;</w:t>
-      </w:r>
-    </w:p>
-    <w:p>
-      <w:pPr>
-        <w:pStyle w:val="Code"/>
-      </w:pPr>
-      <w:r>
-        <w:t xml:space="preserve">        Clicks++;</w:t>
-      </w:r>
-    </w:p>
-    <w:p>
-      <w:pPr>
-        <w:pStyle w:val="Code"/>
-      </w:pPr>
-      <w:r>
-        <w:t xml:space="preserve">        if (first == null)</w:t>
-      </w:r>
-    </w:p>
-    <w:p>
-      <w:pPr>
-        <w:pStyle w:val="Code"/>
-      </w:pPr>
-      <w:r>
-        <w:t xml:space="preserve">        {</w:t>
-      </w:r>
-    </w:p>
-    <w:p>
-      <w:pPr>
-        <w:pStyle w:val="Code"/>
-      </w:pPr>
-      <w:r>
-        <w:t xml:space="preserve">            first = card;</w:t>
-      </w:r>
-    </w:p>
-    <w:p>
-      <w:pPr>
-        <w:pStyle w:val="Code"/>
-      </w:pPr>
-      <w:r>
-        <w:t xml:space="preserve">            return null;</w:t>
-      </w:r>
-    </w:p>
-    <w:p>
-      <w:pPr>
-        <w:pStyle w:val="Code"/>
-      </w:pPr>
-      <w:r>
-        <w:t xml:space="preserve">        }</w:t>
-      </w:r>
-    </w:p>
-    <w:p>
-      <w:pPr>
-        <w:pStyle w:val="Code"/>
-      </w:pPr>
-      <w:r>
-        <w:t xml:space="preserve">        second = card;</w:t>
-      </w:r>
-    </w:p>
-    <w:p>
-      <w:pPr>
-        <w:pStyle w:val="Code"/>
-      </w:pPr>
-      <w:r>
-        <w:t xml:space="preserve">        Moves++;</w:t>
-      </w:r>
-    </w:p>
-    <w:p>
-      <w:pPr>
-        <w:pStyle w:val="Code"/>
-      </w:pPr>
-      <w:r>
-        <w:t xml:space="preserve">        if (first.Creature != second.Creature)</w:t>
-      </w:r>
-    </w:p>
-    <w:p>
-      <w:pPr>
-        <w:pStyle w:val="Code"/>
-      </w:pPr>
-      <w:r>
-        <w:t xml:space="preserve">        {</w:t>
-      </w:r>
-    </w:p>
-    <w:p>
-      <w:pPr>
-        <w:pStyle w:val="Code"/>
-      </w:pPr>
-      <w:r>
-        <w:t xml:space="preserve">            Score = ScoreManager.Miss(Score);</w:t>
-      </w:r>
-    </w:p>
-    <w:p>
-      <w:pPr>
-        <w:pStyle w:val="Code"/>
-      </w:pPr>
-      <w:r>
-        <w:t xml:space="preserve">            return false;</w:t>
-      </w:r>
-    </w:p>
-    <w:p>
-      <w:pPr>
-        <w:pStyle w:val="Code"/>
-      </w:pPr>
-      <w:r>
-        <w:t xml:space="preserve">        }</w:t>
-      </w:r>
-    </w:p>
-    <w:p>
-      <w:pPr>
-        <w:pStyle w:val="Code"/>
-      </w:pPr>
-      <w:r>
-        <w:t xml:space="preserve">        first.Matched = second.Matched = true;</w:t>
-      </w:r>
-    </w:p>
-    <w:p>
-      <w:pPr>
-        <w:pStyle w:val="Code"/>
-      </w:pPr>
-      <w:r>
-        <w:t xml:space="preserve">        first = second = null;</w:t>
-      </w:r>
-    </w:p>
-    <w:p>
-      <w:pPr>
-        <w:pStyle w:val="Code"/>
-      </w:pPr>
-      <w:r>
-        <w:t xml:space="preserve">        Score = ScoreManager.Match(Score);</w:t>
-      </w:r>
-    </w:p>
-    <w:p>
-      <w:pPr>
-        <w:pStyle w:val="Code"/>
-      </w:pPr>
-      <w:r>
-        <w:t xml:space="preserve">        if (Pairs == Cards.Count / 2)</w:t>
-      </w:r>
-    </w:p>
-    <w:p>
-      <w:pPr>
-        <w:pStyle w:val="Code"/>
-      </w:pPr>
-      <w:r>
-        <w:t xml:space="preserve">        {</w:t>
-      </w:r>
-    </w:p>
-    <w:p>
-      <w:pPr>
-        <w:pStyle w:val="Code"/>
-      </w:pPr>
-      <w:r>
-        <w:t xml:space="preserve">            Score = ScoreManager.Victory(Score, Remaining);</w:t>
-      </w:r>
-    </w:p>
-    <w:p>
-      <w:pPr>
-        <w:pStyle w:val="Code"/>
-      </w:pPr>
-      <w:r>
-        <w:t xml:space="preserve">            State = GameState.Won;</w:t>
-      </w:r>
-    </w:p>
-    <w:p>
-      <w:pPr>
-        <w:pStyle w:val="Code"/>
-      </w:pPr>
-      <w:r>
-        <w:t xml:space="preserve">        }</w:t>
-      </w:r>
-    </w:p>
-    <w:p>
-      <w:pPr>
-        <w:pStyle w:val="Code"/>
-      </w:pPr>
-      <w:r>
-        <w:t xml:space="preserve">        return true;</w:t>
-      </w:r>
-    </w:p>
-    <w:p>
-      <w:pPr>
-        <w:pStyle w:val="Code"/>
-      </w:pPr>
-      <w:r>
-        <w:t xml:space="preserve">    }</w:t>
-      </w:r>
-    </w:p>
-    <w:p>
-      <w:pPr>
-        <w:pStyle w:val="Code"/>
-      </w:pPr>
-      <w:r>
-        <w:t xml:space="preserve">    public void ResolveMismatch()</w:t>
+        <w:t>LANG-01 đến LANG-15 đã thực thi trên Windows: tiến trình mới đọc lựa chọn, bảo toàn điểm/lượt/thời gian/thẻ, dịch bảng điểm, lỗi, hướng dẫn và nhóm. Đã đo text và xem ảnh 100% DPI; màn hình vật lý/DPI cao cần thử riêng. Vai trò sinh viên vẫn là phân công dự kiến.</w:t>
+      </w:r>
+    </w:p>
+    <w:p>
+      <w:pPr>
+        <w:pStyle w:val="Heading2"/>
+      </w:pPr>
+      <w:r>
+        <w:t>Trích đoạn từ source triển khai cuối</w:t>
       </w:r>
     </w:p>
     <w:p>
@@ -1263,7 +769,7 @@
         <w:pStyle w:val="Heading3"/>
       </w:pPr>
       <w:r>
-        <w:t>Tính điểm</w:t>
+        <w:t>Đổi ngôn ngữ</w:t>
       </w:r>
     </w:p>
     <w:p>
@@ -1271,7 +777,7 @@
         <w:rPr>
           <w:b w:val="0"/>
         </w:rPr>
-        <w:t>Nguồn src/GameLogic/GameManager.cs</w:t>
+        <w:t>Nguồn: src/Services/LocalizationManager.cs</w:t>
       </w:r>
     </w:p>
     <w:p>
@@ -1279,7 +785,7 @@
         <w:pStyle w:val="Code"/>
       </w:pPr>
       <w:r>
-        <w:t>public static class ScoreManager</w:t>
+        <w:t xml:space="preserve">    public static void SetLanguage(string cultureCode)</w:t>
       </w:r>
     </w:p>
     <w:p>
@@ -1287,7 +793,7 @@
         <w:pStyle w:val="Code"/>
       </w:pPr>
       <w:r>
-        <w:t>{</w:t>
+        <w:t xml:space="preserve">    {</w:t>
       </w:r>
     </w:p>
     <w:p>
@@ -1295,7 +801,7 @@
         <w:pStyle w:val="Code"/>
       </w:pPr>
       <w:r>
-        <w:t xml:space="preserve">    public static int Match(int score) =&gt; score + 100;</w:t>
+        <w:t xml:space="preserve">        string supported = SupportedLanguages.Contains(cultureCode) ? cultureCode : DefaultLanguage;</w:t>
       </w:r>
     </w:p>
     <w:p>
@@ -1303,7 +809,7 @@
         <w:pStyle w:val="Code"/>
       </w:pPr>
       <w:r>
-        <w:t xml:space="preserve">    public static int Miss(int score) =&gt; Math.Max(0, score - 10);</w:t>
+        <w:t xml:space="preserve">        bool changed = CurrentLanguage != supported;</w:t>
       </w:r>
     </w:p>
     <w:p>
@@ -1311,7 +817,7 @@
         <w:pStyle w:val="Code"/>
       </w:pPr>
       <w:r>
-        <w:t xml:space="preserve">    public static int Victory(int score, int seconds) =&gt; score + seconds * 5;</w:t>
+        <w:t xml:space="preserve">        CurrentLanguage = supported;</w:t>
       </w:r>
     </w:p>
     <w:p>
@@ -1319,7 +825,39 @@
         <w:pStyle w:val="Code"/>
       </w:pPr>
       <w:r>
-        <w:t>}</w:t>
+        <w:t xml:space="preserve">        CultureInfo.CurrentUICulture = Culture;</w:t>
+      </w:r>
+    </w:p>
+    <w:p>
+      <w:pPr>
+        <w:pStyle w:val="Code"/>
+      </w:pPr>
+      <w:r>
+        <w:t xml:space="preserve">        CultureInfo.CurrentCulture = Culture;</w:t>
+      </w:r>
+    </w:p>
+    <w:p>
+      <w:pPr>
+        <w:pStyle w:val="Code"/>
+      </w:pPr>
+      <w:r>
+        <w:t xml:space="preserve">        if (changed)</w:t>
+      </w:r>
+    </w:p>
+    <w:p>
+      <w:pPr>
+        <w:pStyle w:val="Code"/>
+      </w:pPr>
+      <w:r>
+        <w:t xml:space="preserve">            LanguageChanged?.Invoke(null, EventArgs.Empty);</w:t>
+      </w:r>
+    </w:p>
+    <w:p>
+      <w:pPr>
+        <w:pStyle w:val="Code"/>
+      </w:pPr>
+      <w:r>
+        <w:t xml:space="preserve">    }</w:t>
       </w:r>
     </w:p>
     <w:p>
@@ -1327,7 +865,7 @@
         <w:pStyle w:val="Heading3"/>
       </w:pPr>
       <w:r>
-        <w:t>Timer</w:t>
+        <w:t>Khôi phục lựa chọn</w:t>
       </w:r>
     </w:p>
     <w:p>
@@ -1335,7 +873,7 @@
         <w:rPr>
           <w:b w:val="0"/>
         </w:rPr>
-        <w:t>Nguồn src/Forms/GameForm.cs</w:t>
+        <w:t>Nguồn: src/Services/LocalizationManager.cs</w:t>
       </w:r>
     </w:p>
     <w:p>
@@ -1343,7 +881,7 @@
         <w:pStyle w:val="Code"/>
       </w:pPr>
       <w:r>
-        <w:t xml:space="preserve">    private void OnClockTick(object? sender, EventArgs e)</w:t>
+        <w:t xml:space="preserve">    public static string LoadLanguagePreference()</w:t>
       </w:r>
     </w:p>
     <w:p>
@@ -1359,7 +897,7 @@
         <w:pStyle w:val="Code"/>
       </w:pPr>
       <w:r>
-        <w:t xml:space="preserve">        if (Game.State != GameState.Playing)</w:t>
+        <w:t xml:space="preserve">        SettingsLoadFailed = false;</w:t>
       </w:r>
     </w:p>
     <w:p>
@@ -1367,20 +905,23 @@
         <w:pStyle w:val="Code"/>
       </w:pPr>
       <w:r>
-        <w:t xml:space="preserve">            return;</w:t>
+        <w:t xml:space="preserve">        try</w:t>
       </w:r>
     </w:p>
     <w:p>
       <w:pPr>
         <w:pStyle w:val="Code"/>
       </w:pPr>
+      <w:r>
+        <w:t xml:space="preserve">        {</w:t>
+      </w:r>
     </w:p>
     <w:p>
       <w:pPr>
         <w:pStyle w:val="Code"/>
       </w:pPr>
       <w:r>
-        <w:t xml:space="preserve">        // Process every complete active second, including delayed UI ticks.</w:t>
+        <w:t xml:space="preserve">            if (!File.Exists(settingsPath))</w:t>
       </w:r>
     </w:p>
     <w:p>
@@ -1388,7 +929,7 @@
         <w:pStyle w:val="Code"/>
       </w:pPr>
       <w:r>
-        <w:t xml:space="preserve">        while (elapsed.ElapsedMilliseconds / 1000 &gt; processedSeconds &amp;&amp; Game.State == GameState.Playing)</w:t>
+        <w:t xml:space="preserve">                return DefaultLanguage;</w:t>
       </w:r>
     </w:p>
     <w:p>
@@ -1396,6 +937,78 @@
         <w:pStyle w:val="Code"/>
       </w:pPr>
       <w:r>
+        <w:t xml:space="preserve">            using JsonDocument document = JsonDocument.Parse(File.ReadAllText(settingsPath));</w:t>
+      </w:r>
+    </w:p>
+    <w:p>
+      <w:pPr>
+        <w:pStyle w:val="Code"/>
+      </w:pPr>
+      <w:r>
+        <w:t xml:space="preserve">            if (document.RootElement.ValueKind == JsonValueKind.Object &amp;&amp;</w:t>
+      </w:r>
+    </w:p>
+    <w:p>
+      <w:pPr>
+        <w:pStyle w:val="Code"/>
+      </w:pPr>
+      <w:r>
+        <w:t xml:space="preserve">                document.RootElement.TryGetProperty("language", out JsonElement language) &amp;&amp;</w:t>
+      </w:r>
+    </w:p>
+    <w:p>
+      <w:pPr>
+        <w:pStyle w:val="Code"/>
+      </w:pPr>
+      <w:r>
+        <w:t xml:space="preserve">                language.ValueKind == JsonValueKind.String &amp;&amp; </w:t>
+      </w:r>
+    </w:p>
+    <w:p>
+      <w:pPr>
+        <w:pStyle w:val="Code"/>
+      </w:pPr>
+      <w:r>
+        <w:t>SupportedLanguages.Contains(language.GetString()))</w:t>
+      </w:r>
+    </w:p>
+    <w:p>
+      <w:pPr>
+        <w:pStyle w:val="Code"/>
+      </w:pPr>
+      <w:r>
+        <w:t xml:space="preserve">                return language.GetString()!;</w:t>
+      </w:r>
+    </w:p>
+    <w:p>
+      <w:pPr>
+        <w:pStyle w:val="Code"/>
+      </w:pPr>
+      <w:r>
+        <w:t xml:space="preserve">            SettingsLoadFailed = true;</w:t>
+      </w:r>
+    </w:p>
+    <w:p>
+      <w:pPr>
+        <w:pStyle w:val="Code"/>
+      </w:pPr>
+      <w:r>
+        <w:t xml:space="preserve">        }</w:t>
+      </w:r>
+    </w:p>
+    <w:p>
+      <w:pPr>
+        <w:pStyle w:val="Code"/>
+      </w:pPr>
+      <w:r>
+        <w:t xml:space="preserve">        catch (Exception ex) when (ex is IOException or UnauthorizedAccessException or JsonException)</w:t>
+      </w:r>
+    </w:p>
+    <w:p>
+      <w:pPr>
+        <w:pStyle w:val="Code"/>
+      </w:pPr>
+      <w:r>
         <w:t xml:space="preserve">        {</w:t>
       </w:r>
     </w:p>
@@ -1404,7 +1017,7 @@
         <w:pStyle w:val="Code"/>
       </w:pPr>
       <w:r>
-        <w:t xml:space="preserve">            processedSeconds++;</w:t>
+        <w:t xml:space="preserve">            SettingsLoadFailed = true;</w:t>
       </w:r>
     </w:p>
     <w:p>
@@ -1412,7 +1025,7 @@
         <w:pStyle w:val="Code"/>
       </w:pPr>
       <w:r>
-        <w:t xml:space="preserve">            Game.Tick();</w:t>
+        <w:t xml:space="preserve">        }</w:t>
       </w:r>
     </w:p>
     <w:p>
@@ -1420,7 +1033,7 @@
         <w:pStyle w:val="Code"/>
       </w:pPr>
       <w:r>
-        <w:t xml:space="preserve">        }</w:t>
+        <w:t xml:space="preserve">        return DefaultLanguage;</w:t>
       </w:r>
     </w:p>
     <w:p>
@@ -1428,52 +1041,15 @@
         <w:pStyle w:val="Code"/>
       </w:pPr>
       <w:r>
-        <w:t xml:space="preserve">        RefreshGame();</w:t>
-      </w:r>
-    </w:p>
-    <w:p>
-      <w:pPr>
-        <w:pStyle w:val="Code"/>
-      </w:pPr>
-      <w:r>
-        <w:t xml:space="preserve">        FinishIfNeeded();</w:t>
-      </w:r>
-    </w:p>
-    <w:p>
-      <w:pPr>
-        <w:pStyle w:val="Code"/>
-      </w:pPr>
-      <w:r>
         <w:t xml:space="preserve">    }</w:t>
       </w:r>
     </w:p>
     <w:p>
       <w:pPr>
-        <w:pStyle w:val="Code"/>
-      </w:pPr>
-    </w:p>
-    <w:p>
-      <w:pPr>
-        <w:pStyle w:val="Code"/>
-      </w:pPr>
-      <w:r>
-        <w:t xml:space="preserve">    private void OnFlipTick(object? sender, EventArgs e)</w:t>
-      </w:r>
-    </w:p>
-    <w:p>
-      <w:pPr>
-        <w:pStyle w:val="Code"/>
-      </w:pPr>
-      <w:r>
-        <w:t xml:space="preserve">    {</w:t>
-      </w:r>
-    </w:p>
-    <w:p>
-      <w:pPr>
         <w:pStyle w:val="Heading3"/>
       </w:pPr>
       <w:r>
-        <w:t>Pause Resume</w:t>
+        <w:t>Lưu lựa chọn</w:t>
       </w:r>
     </w:p>
     <w:p>
@@ -1481,7 +1057,7 @@
         <w:rPr>
           <w:b w:val="0"/>
         </w:rPr>
-        <w:t>Nguồn src/Forms/GameForm.cs</w:t>
+        <w:t>Nguồn: src/Services/LocalizationManager.cs</w:t>
       </w:r>
     </w:p>
     <w:p>
@@ -1489,7 +1065,7 @@
         <w:pStyle w:val="Code"/>
       </w:pPr>
       <w:r>
-        <w:t xml:space="preserve">    public void TogglePause()</w:t>
+        <w:t xml:space="preserve">    public static bool SaveLanguagePreference()</w:t>
       </w:r>
     </w:p>
     <w:p>
@@ -1505,7 +1081,7 @@
         <w:pStyle w:val="Code"/>
       </w:pPr>
       <w:r>
-        <w:t xml:space="preserve">        if (Game.State is not (GameState.Playing or GameState.Paused))</w:t>
+        <w:t xml:space="preserve">        string temporary = settingsPath + ".tmp";</w:t>
       </w:r>
     </w:p>
     <w:p>
@@ -1513,7 +1089,7 @@
         <w:pStyle w:val="Code"/>
       </w:pPr>
       <w:r>
-        <w:t xml:space="preserve">            return;</w:t>
+        <w:t xml:space="preserve">        try</w:t>
       </w:r>
     </w:p>
     <w:p>
@@ -1521,7 +1097,7 @@
         <w:pStyle w:val="Code"/>
       </w:pPr>
       <w:r>
-        <w:t xml:space="preserve">        Game.TogglePause();</w:t>
+        <w:t xml:space="preserve">        {</w:t>
       </w:r>
     </w:p>
     <w:p>
@@ -1529,7 +1105,7 @@
         <w:pStyle w:val="Code"/>
       </w:pPr>
       <w:r>
-        <w:t xml:space="preserve">        if (Game.State == GameState.Paused)</w:t>
+        <w:t xml:space="preserve">            Directory.CreateDirectory(Path.GetDirectoryName(settingsPath)!);</w:t>
       </w:r>
     </w:p>
     <w:p>
@@ -1537,6 +1113,54 @@
         <w:pStyle w:val="Code"/>
       </w:pPr>
       <w:r>
+        <w:t xml:space="preserve">            File.WriteAllText(temporary, JsonSerializer.Serialize(new { language = CurrentLanguage }));</w:t>
+      </w:r>
+    </w:p>
+    <w:p>
+      <w:pPr>
+        <w:pStyle w:val="Code"/>
+      </w:pPr>
+      <w:r>
+        <w:t xml:space="preserve">            File.Move(temporary, settingsPath, true);</w:t>
+      </w:r>
+    </w:p>
+    <w:p>
+      <w:pPr>
+        <w:pStyle w:val="Code"/>
+      </w:pPr>
+      <w:r>
+        <w:t xml:space="preserve">            SettingsLoadFailed = false;</w:t>
+      </w:r>
+    </w:p>
+    <w:p>
+      <w:pPr>
+        <w:pStyle w:val="Code"/>
+      </w:pPr>
+      <w:r>
+        <w:t xml:space="preserve">            return true;</w:t>
+      </w:r>
+    </w:p>
+    <w:p>
+      <w:pPr>
+        <w:pStyle w:val="Code"/>
+      </w:pPr>
+      <w:r>
+        <w:t xml:space="preserve">        }</w:t>
+      </w:r>
+    </w:p>
+    <w:p>
+      <w:pPr>
+        <w:pStyle w:val="Code"/>
+      </w:pPr>
+      <w:r>
+        <w:t xml:space="preserve">        catch (Exception ex) when (ex is IOException or UnauthorizedAccessException)</w:t>
+      </w:r>
+    </w:p>
+    <w:p>
+      <w:pPr>
+        <w:pStyle w:val="Code"/>
+      </w:pPr>
+      <w:r>
         <w:t xml:space="preserve">        {</w:t>
       </w:r>
     </w:p>
@@ -1545,7 +1169,7 @@
         <w:pStyle w:val="Code"/>
       </w:pPr>
       <w:r>
-        <w:t xml:space="preserve">            elapsed.Stop();</w:t>
+        <w:t xml:space="preserve">            return false;</w:t>
       </w:r>
     </w:p>
     <w:p>
@@ -1553,7 +1177,7 @@
         <w:pStyle w:val="Code"/>
       </w:pPr>
       <w:r>
-        <w:t xml:space="preserve">            mismatch.Stop();</w:t>
+        <w:t xml:space="preserve">        }</w:t>
       </w:r>
     </w:p>
     <w:p>
@@ -1561,135 +1185,15 @@
         <w:pStyle w:val="Code"/>
       </w:pPr>
       <w:r>
-        <w:t xml:space="preserve">            flip.Stop();</w:t>
-      </w:r>
-    </w:p>
-    <w:p>
-      <w:pPr>
-        <w:pStyle w:val="Code"/>
-      </w:pPr>
-      <w:r>
-        <w:t xml:space="preserve">            audio.SetActive(false);</w:t>
-      </w:r>
-    </w:p>
-    <w:p>
-      <w:pPr>
-        <w:pStyle w:val="Code"/>
-      </w:pPr>
-      <w:r>
-        <w:t xml:space="preserve">        }</w:t>
-      </w:r>
-    </w:p>
-    <w:p>
-      <w:pPr>
-        <w:pStyle w:val="Code"/>
-      </w:pPr>
-      <w:r>
-        <w:t xml:space="preserve">        else</w:t>
-      </w:r>
-    </w:p>
-    <w:p>
-      <w:pPr>
-        <w:pStyle w:val="Code"/>
-      </w:pPr>
-      <w:r>
-        <w:t xml:space="preserve">        {</w:t>
-      </w:r>
-    </w:p>
-    <w:p>
-      <w:pPr>
-        <w:pStyle w:val="Code"/>
-      </w:pPr>
-      <w:r>
-        <w:t xml:space="preserve">            elapsed.Start();</w:t>
-      </w:r>
-    </w:p>
-    <w:p>
-      <w:pPr>
-        <w:pStyle w:val="Code"/>
-      </w:pPr>
-      <w:r>
-        <w:t xml:space="preserve">            if (Game.InputLocked)</w:t>
-      </w:r>
-    </w:p>
-    <w:p>
-      <w:pPr>
-        <w:pStyle w:val="Code"/>
-      </w:pPr>
-      <w:r>
-        <w:t xml:space="preserve">            {</w:t>
-      </w:r>
-    </w:p>
-    <w:p>
-      <w:pPr>
-        <w:pStyle w:val="Code"/>
-      </w:pPr>
-      <w:r>
-        <w:t xml:space="preserve">                mismatch.Start();</w:t>
-      </w:r>
-    </w:p>
-    <w:p>
-      <w:pPr>
-        <w:pStyle w:val="Code"/>
-      </w:pPr>
-      <w:r>
-        <w:t xml:space="preserve">                flip.Start();</w:t>
-      </w:r>
-    </w:p>
-    <w:p>
-      <w:pPr>
-        <w:pStyle w:val="Code"/>
-      </w:pPr>
-      <w:r>
-        <w:t xml:space="preserve">            }</w:t>
-      </w:r>
-    </w:p>
-    <w:p>
-      <w:pPr>
-        <w:pStyle w:val="Code"/>
-      </w:pPr>
-      <w:r>
-        <w:t xml:space="preserve">            audio.SetActive(true);</w:t>
-      </w:r>
-    </w:p>
-    <w:p>
-      <w:pPr>
-        <w:pStyle w:val="Code"/>
-      </w:pPr>
-      <w:r>
-        <w:t xml:space="preserve">        }</w:t>
-      </w:r>
-    </w:p>
-    <w:p>
-      <w:pPr>
-        <w:pStyle w:val="Code"/>
-      </w:pPr>
-      <w:r>
-        <w:t xml:space="preserve">        RefreshGame();</w:t>
-      </w:r>
-    </w:p>
-    <w:p>
-      <w:pPr>
-        <w:pStyle w:val="Code"/>
-      </w:pPr>
-      <w:r>
         <w:t xml:space="preserve">    }</w:t>
       </w:r>
     </w:p>
     <w:p>
       <w:pPr>
-        <w:pStyle w:val="Code"/>
-      </w:pPr>
-      <w:r>
-        <w:t xml:space="preserve">    private void RefreshGame()</w:t>
-      </w:r>
-    </w:p>
-    <w:p>
-      <w:pPr>
         <w:pStyle w:val="Heading3"/>
       </w:pPr>
       <w:r>
-        <w:t>System IO</w:t>
+        <w:t>Đổi chữ giữ nguyên ván</w:t>
       </w:r>
     </w:p>
     <w:p>
@@ -1697,7 +1201,7 @@
         <w:rPr>
           <w:b w:val="0"/>
         </w:rPr>
-        <w:t>Nguồn src/Services/LeaderboardService.cs</w:t>
+        <w:t>Nguồn: src/Forms/GameForm.cs</w:t>
       </w:r>
     </w:p>
     <w:p>
@@ -1705,7 +1209,7 @@
         <w:pStyle w:val="Code"/>
       </w:pPr>
       <w:r>
-        <w:t xml:space="preserve">    public bool Save(Result result)</w:t>
+        <w:t xml:space="preserve">    public override void ApplyLocalization()</w:t>
       </w:r>
     </w:p>
     <w:p>
@@ -1721,7 +1225,7 @@
         <w:pStyle w:val="Code"/>
       </w:pPr>
       <w:r>
-        <w:t xml:space="preserve">        try</w:t>
+        <w:t xml:space="preserve">        base.ApplyLocalization();</w:t>
       </w:r>
     </w:p>
     <w:p>
@@ -1729,7 +1233,7 @@
         <w:pStyle w:val="Code"/>
       </w:pPr>
       <w:r>
-        <w:t xml:space="preserve">        {</w:t>
+        <w:t xml:space="preserve">        // Text only: never call ResetGame or touch the Stopwatches here.</w:t>
       </w:r>
     </w:p>
     <w:p>
@@ -1737,7 +1241,7 @@
         <w:pStyle w:val="Code"/>
       </w:pPr>
       <w:r>
-        <w:t xml:space="preserve">            ValidateName(result.Name);</w:t>
+        <w:t xml:space="preserve">        RefreshGame();</w:t>
       </w:r>
     </w:p>
     <w:p>
@@ -1745,70 +1249,6 @@
         <w:pStyle w:val="Code"/>
       </w:pPr>
       <w:r>
-        <w:t xml:space="preserve">            EnsureFile();</w:t>
-      </w:r>
-    </w:p>
-    <w:p>
-      <w:pPr>
-        <w:pStyle w:val="Code"/>
-      </w:pPr>
-      <w:r>
-        <w:t xml:space="preserve">            File.AppendAllText(FilePath, JsonSerializer.Serialize(result) + Environment.NewLine);</w:t>
-      </w:r>
-    </w:p>
-    <w:p>
-      <w:pPr>
-        <w:pStyle w:val="Code"/>
-      </w:pPr>
-      <w:r>
-        <w:t xml:space="preserve">            return true;</w:t>
-      </w:r>
-    </w:p>
-    <w:p>
-      <w:pPr>
-        <w:pStyle w:val="Code"/>
-      </w:pPr>
-      <w:r>
-        <w:t xml:space="preserve">        }</w:t>
-      </w:r>
-    </w:p>
-    <w:p>
-      <w:pPr>
-        <w:pStyle w:val="Code"/>
-      </w:pPr>
-      <w:r>
-        <w:t xml:space="preserve">        catch (Exception e) when (e is IOException or UnauthorizedAccessException) { Fallback(); try { </w:t>
-      </w:r>
-    </w:p>
-    <w:p>
-      <w:pPr>
-        <w:pStyle w:val="Code"/>
-      </w:pPr>
-      <w:r>
-        <w:t xml:space="preserve">EnsureFile(); File.AppendAllText(FilePath, JsonSerializer.Serialize(result) + Environment.NewLine); </w:t>
-      </w:r>
-    </w:p>
-    <w:p>
-      <w:pPr>
-        <w:pStyle w:val="Code"/>
-      </w:pPr>
-      <w:r>
-        <w:t xml:space="preserve">return true; } catch (Exception ex) when (ex is IOException or UnauthorizedAccessException) { </w:t>
-      </w:r>
-    </w:p>
-    <w:p>
-      <w:pPr>
-        <w:pStyle w:val="Code"/>
-      </w:pPr>
-      <w:r>
-        <w:t>warn($"Result could not be saved: {ex.Message}"); return false; } }</w:t>
-      </w:r>
-    </w:p>
-    <w:p>
-      <w:pPr>
-        <w:pStyle w:val="Code"/>
-      </w:pPr>
-      <w:r>
         <w:t xml:space="preserve">    }</w:t>
       </w:r>
     </w:p>
@@ -1817,7 +1257,7 @@
         <w:pStyle w:val="Heading3"/>
       </w:pPr>
       <w:r>
-        <w:t>SoundPlayer và try catch</w:t>
+        <w:t>Đếm ngược</w:t>
       </w:r>
     </w:p>
     <w:p>
@@ -1825,7 +1265,7 @@
         <w:rPr>
           <w:b w:val="0"/>
         </w:rPr>
-        <w:t>Nguồn src/Services/AudioManager.cs</w:t>
+        <w:t>Nguồn: src/Forms/GameForm.cs</w:t>
       </w:r>
     </w:p>
     <w:p>
@@ -1833,7 +1273,7 @@
         <w:pStyle w:val="Code"/>
       </w:pPr>
       <w:r>
-        <w:t xml:space="preserve">    private void Play(string file, bool loop = false)</w:t>
+        <w:t xml:space="preserve">    private void OnClockTick(object? sender, EventArgs e)</w:t>
       </w:r>
     </w:p>
     <w:p>
@@ -1849,7 +1289,7 @@
         <w:pStyle w:val="Code"/>
       </w:pPr>
       <w:r>
-        <w:t xml:space="preserve">        if (!players.TryGetValue(file, out var player))</w:t>
+        <w:t xml:space="preserve">        if (Game.State != GameState.Playing)</w:t>
       </w:r>
     </w:p>
     <w:p>
@@ -1864,15 +1304,28 @@
       <w:pPr>
         <w:pStyle w:val="Code"/>
       </w:pPr>
-      <w:r>
-        <w:t xml:space="preserve">        try</w:t>
-      </w:r>
     </w:p>
     <w:p>
       <w:pPr>
         <w:pStyle w:val="Code"/>
       </w:pPr>
       <w:r>
+        <w:t xml:space="preserve">        // Process every complete active second, including delayed UI ticks.</w:t>
+      </w:r>
+    </w:p>
+    <w:p>
+      <w:pPr>
+        <w:pStyle w:val="Code"/>
+      </w:pPr>
+      <w:r>
+        <w:t xml:space="preserve">        while (elapsed.ElapsedMilliseconds / 1000 &gt; processedSeconds &amp;&amp; Game.State == GameState.Playing)</w:t>
+      </w:r>
+    </w:p>
+    <w:p>
+      <w:pPr>
+        <w:pStyle w:val="Code"/>
+      </w:pPr>
+      <w:r>
         <w:t xml:space="preserve">        {</w:t>
       </w:r>
     </w:p>
@@ -1881,7 +1334,7 @@
         <w:pStyle w:val="Code"/>
       </w:pPr>
       <w:r>
-        <w:t xml:space="preserve">            if (loop)</w:t>
+        <w:t xml:space="preserve">            processedSeconds++;</w:t>
       </w:r>
     </w:p>
     <w:p>
@@ -1889,7 +1342,7 @@
         <w:pStyle w:val="Code"/>
       </w:pPr>
       <w:r>
-        <w:t xml:space="preserve">                player.PlayLooping();</w:t>
+        <w:t xml:space="preserve">            Game.Tick();</w:t>
       </w:r>
     </w:p>
     <w:p>
@@ -1897,7 +1350,7 @@
         <w:pStyle w:val="Code"/>
       </w:pPr>
       <w:r>
-        <w:t xml:space="preserve">            else</w:t>
+        <w:t xml:space="preserve">        }</w:t>
       </w:r>
     </w:p>
     <w:p>
@@ -1905,7 +1358,7 @@
         <w:pStyle w:val="Code"/>
       </w:pPr>
       <w:r>
-        <w:t xml:space="preserve">                player.Play();</w:t>
+        <w:t xml:space="preserve">        RefreshGame();</w:t>
       </w:r>
     </w:p>
     <w:p>
@@ -1913,7 +1366,7 @@
         <w:pStyle w:val="Code"/>
       </w:pPr>
       <w:r>
-        <w:t xml:space="preserve">        }</w:t>
+        <w:t xml:space="preserve">        FinishIfNeeded();</w:t>
       </w:r>
     </w:p>
     <w:p>
@@ -1921,60 +1374,15 @@
         <w:pStyle w:val="Code"/>
       </w:pPr>
       <w:r>
-        <w:t xml:space="preserve">        catch (Exception ex) when (ex is IOException or UnauthorizedAccessException or </w:t>
-      </w:r>
-    </w:p>
-    <w:p>
-      <w:pPr>
-        <w:pStyle w:val="Code"/>
-      </w:pPr>
-      <w:r>
-        <w:t xml:space="preserve">InvalidOperationException or System.ComponentModel.Win32Exception) { resources.Warn($"Audio playback </w:t>
-      </w:r>
-    </w:p>
-    <w:p>
-      <w:pPr>
-        <w:pStyle w:val="Code"/>
-      </w:pPr>
-      <w:r>
-        <w:t>failed for {file}. {ex.Message}"); players.Remove(file); player.Dispose(); }</w:t>
-      </w:r>
-    </w:p>
-    <w:p>
-      <w:pPr>
-        <w:pStyle w:val="Code"/>
-      </w:pPr>
-      <w:r>
         <w:t xml:space="preserve">    }</w:t>
       </w:r>
     </w:p>
     <w:p>
       <w:pPr>
-        <w:pStyle w:val="Code"/>
-      </w:pPr>
-      <w:r>
-        <w:t xml:space="preserve">    private void Background()</w:t>
-      </w:r>
-    </w:p>
-    <w:p>
-      <w:r>
-        <w:br w:type="page"/>
-      </w:r>
-    </w:p>
-    <w:p>
-      <w:pPr>
-        <w:pStyle w:val="Heading1"/>
-      </w:pPr>
-      <w:r>
-        <w:t>Chương 5 Kiểm thử</w:t>
-      </w:r>
-    </w:p>
-    <w:p>
-      <w:pPr>
-        <w:pStyle w:val="Heading2"/>
-      </w:pPr>
-      <w:r>
-        <w:t>Phương pháp và kết quả</w:t>
+        <w:pStyle w:val="Heading3"/>
+      </w:pPr>
+      <w:r>
+        <w:t>So khớp và khóa thẻ</w:t>
       </w:r>
     </w:p>
     <w:p>
@@ -1982,7 +1390,796 @@
         <w:rPr>
           <w:b w:val="0"/>
         </w:rPr>
-        <w:t>Build Release có 0 lỗi và 0 cảnh báo. Solution mở trong Visual Studio, title/debug target được quan sát qua accessibility. SelfTests chạy STA, mở form thật, dùng PerformClick đi qua handler, bơm message loop để WinForms Timer thực sự Tick. Application.DoEvents chỉ dùng trong harness kiểm thử. TEST_RESULTS.txt ghi 43 PASS của lần chạy cuối; TEST_PLAN.md có từng bước, mong đợi và thực tế.</w:t>
+        <w:t>Nguồn: src/GameLogic/GameManager.cs</w:t>
+      </w:r>
+    </w:p>
+    <w:p>
+      <w:pPr>
+        <w:pStyle w:val="Code"/>
+      </w:pPr>
+      <w:r>
+        <w:t xml:space="preserve">    public bool? Select(int index)</w:t>
+      </w:r>
+    </w:p>
+    <w:p>
+      <w:pPr>
+        <w:pStyle w:val="Code"/>
+      </w:pPr>
+      <w:r>
+        <w:t xml:space="preserve">    {</w:t>
+      </w:r>
+    </w:p>
+    <w:p>
+      <w:pPr>
+        <w:pStyle w:val="Code"/>
+      </w:pPr>
+      <w:r>
+        <w:t xml:space="preserve">        if (State != GameState.Playing || InputLocked || index &lt; 0 || index &gt;= Cards.Count)</w:t>
+      </w:r>
+    </w:p>
+    <w:p>
+      <w:pPr>
+        <w:pStyle w:val="Code"/>
+      </w:pPr>
+      <w:r>
+        <w:t xml:space="preserve">            return null;</w:t>
+      </w:r>
+    </w:p>
+    <w:p>
+      <w:pPr>
+        <w:pStyle w:val="Code"/>
+      </w:pPr>
+      <w:r>
+        <w:t xml:space="preserve">        var card = Cards[index];</w:t>
+      </w:r>
+    </w:p>
+    <w:p>
+      <w:pPr>
+        <w:pStyle w:val="Code"/>
+      </w:pPr>
+      <w:r>
+        <w:t xml:space="preserve">        if (card.Revealed || card.Matched)</w:t>
+      </w:r>
+    </w:p>
+    <w:p>
+      <w:pPr>
+        <w:pStyle w:val="Code"/>
+      </w:pPr>
+      <w:r>
+        <w:t xml:space="preserve">            return null;</w:t>
+      </w:r>
+    </w:p>
+    <w:p>
+      <w:pPr>
+        <w:pStyle w:val="Code"/>
+      </w:pPr>
+      <w:r>
+        <w:t xml:space="preserve">        card.Revealed = true;</w:t>
+      </w:r>
+    </w:p>
+    <w:p>
+      <w:pPr>
+        <w:pStyle w:val="Code"/>
+      </w:pPr>
+      <w:r>
+        <w:t xml:space="preserve">        Clicks++;</w:t>
+      </w:r>
+    </w:p>
+    <w:p>
+      <w:pPr>
+        <w:pStyle w:val="Code"/>
+      </w:pPr>
+      <w:r>
+        <w:t xml:space="preserve">        if (first == null)</w:t>
+      </w:r>
+    </w:p>
+    <w:p>
+      <w:pPr>
+        <w:pStyle w:val="Code"/>
+      </w:pPr>
+      <w:r>
+        <w:t xml:space="preserve">        {</w:t>
+      </w:r>
+    </w:p>
+    <w:p>
+      <w:pPr>
+        <w:pStyle w:val="Code"/>
+      </w:pPr>
+      <w:r>
+        <w:t xml:space="preserve">            first = card;</w:t>
+      </w:r>
+    </w:p>
+    <w:p>
+      <w:pPr>
+        <w:pStyle w:val="Code"/>
+      </w:pPr>
+      <w:r>
+        <w:t xml:space="preserve">            return null;</w:t>
+      </w:r>
+    </w:p>
+    <w:p>
+      <w:pPr>
+        <w:pStyle w:val="Code"/>
+      </w:pPr>
+      <w:r>
+        <w:t xml:space="preserve">        }</w:t>
+      </w:r>
+    </w:p>
+    <w:p>
+      <w:pPr>
+        <w:pStyle w:val="Code"/>
+      </w:pPr>
+      <w:r>
+        <w:t xml:space="preserve">        second = card;</w:t>
+      </w:r>
+    </w:p>
+    <w:p>
+      <w:pPr>
+        <w:pStyle w:val="Code"/>
+      </w:pPr>
+      <w:r>
+        <w:t xml:space="preserve">        Moves++;</w:t>
+      </w:r>
+    </w:p>
+    <w:p>
+      <w:pPr>
+        <w:pStyle w:val="Code"/>
+      </w:pPr>
+      <w:r>
+        <w:t xml:space="preserve">        if (first.Creature != second.Creature)</w:t>
+      </w:r>
+    </w:p>
+    <w:p>
+      <w:pPr>
+        <w:pStyle w:val="Code"/>
+      </w:pPr>
+      <w:r>
+        <w:t xml:space="preserve">        {</w:t>
+      </w:r>
+    </w:p>
+    <w:p>
+      <w:pPr>
+        <w:pStyle w:val="Code"/>
+      </w:pPr>
+      <w:r>
+        <w:t xml:space="preserve">            Score = ScoreManager.Miss(Score);</w:t>
+      </w:r>
+    </w:p>
+    <w:p>
+      <w:pPr>
+        <w:pStyle w:val="Code"/>
+      </w:pPr>
+      <w:r>
+        <w:t xml:space="preserve">            return false;</w:t>
+      </w:r>
+    </w:p>
+    <w:p>
+      <w:pPr>
+        <w:pStyle w:val="Code"/>
+      </w:pPr>
+      <w:r>
+        <w:t xml:space="preserve">        }</w:t>
+      </w:r>
+    </w:p>
+    <w:p>
+      <w:pPr>
+        <w:pStyle w:val="Code"/>
+      </w:pPr>
+      <w:r>
+        <w:t xml:space="preserve">        first.Matched = second.Matched = true;</w:t>
+      </w:r>
+    </w:p>
+    <w:p>
+      <w:pPr>
+        <w:pStyle w:val="Code"/>
+      </w:pPr>
+      <w:r>
+        <w:t xml:space="preserve">        first = second = null;</w:t>
+      </w:r>
+    </w:p>
+    <w:p>
+      <w:pPr>
+        <w:pStyle w:val="Code"/>
+      </w:pPr>
+      <w:r>
+        <w:t xml:space="preserve">        Score = ScoreManager.Match(Score);</w:t>
+      </w:r>
+    </w:p>
+    <w:p>
+      <w:pPr>
+        <w:pStyle w:val="Code"/>
+      </w:pPr>
+      <w:r>
+        <w:t xml:space="preserve">        if (Pairs == Cards.Count / 2)</w:t>
+      </w:r>
+    </w:p>
+    <w:p>
+      <w:pPr>
+        <w:pStyle w:val="Code"/>
+      </w:pPr>
+      <w:r>
+        <w:t xml:space="preserve">        {</w:t>
+      </w:r>
+    </w:p>
+    <w:p>
+      <w:pPr>
+        <w:pStyle w:val="Code"/>
+      </w:pPr>
+      <w:r>
+        <w:t xml:space="preserve">            Score = ScoreManager.Victory(Score, Remaining);</w:t>
+      </w:r>
+    </w:p>
+    <w:p>
+      <w:pPr>
+        <w:pStyle w:val="Code"/>
+      </w:pPr>
+      <w:r>
+        <w:t xml:space="preserve">            State = GameState.Won;</w:t>
+      </w:r>
+    </w:p>
+    <w:p>
+      <w:pPr>
+        <w:pStyle w:val="Code"/>
+      </w:pPr>
+      <w:r>
+        <w:t xml:space="preserve">        }</w:t>
+      </w:r>
+    </w:p>
+    <w:p>
+      <w:pPr>
+        <w:pStyle w:val="Code"/>
+      </w:pPr>
+      <w:r>
+        <w:t xml:space="preserve">        return true;</w:t>
+      </w:r>
+    </w:p>
+    <w:p>
+      <w:pPr>
+        <w:pStyle w:val="Code"/>
+      </w:pPr>
+      <w:r>
+        <w:t xml:space="preserve">    }</w:t>
+      </w:r>
+    </w:p>
+    <w:p>
+      <w:pPr>
+        <w:pStyle w:val="Heading3"/>
+      </w:pPr>
+      <w:r>
+        <w:t>System.IO</w:t>
+      </w:r>
+    </w:p>
+    <w:p>
+      <w:r>
+        <w:rPr>
+          <w:b w:val="0"/>
+        </w:rPr>
+        <w:t>Nguồn: src/Services/LeaderboardService.cs</w:t>
+      </w:r>
+    </w:p>
+    <w:p>
+      <w:pPr>
+        <w:pStyle w:val="Code"/>
+      </w:pPr>
+      <w:r>
+        <w:t xml:space="preserve">    public bool Save(Result result)</w:t>
+      </w:r>
+    </w:p>
+    <w:p>
+      <w:pPr>
+        <w:pStyle w:val="Code"/>
+      </w:pPr>
+      <w:r>
+        <w:t xml:space="preserve">    {</w:t>
+      </w:r>
+    </w:p>
+    <w:p>
+      <w:pPr>
+        <w:pStyle w:val="Code"/>
+      </w:pPr>
+      <w:r>
+        <w:t xml:space="preserve">        try</w:t>
+      </w:r>
+    </w:p>
+    <w:p>
+      <w:pPr>
+        <w:pStyle w:val="Code"/>
+      </w:pPr>
+      <w:r>
+        <w:t xml:space="preserve">        {</w:t>
+      </w:r>
+    </w:p>
+    <w:p>
+      <w:pPr>
+        <w:pStyle w:val="Code"/>
+      </w:pPr>
+      <w:r>
+        <w:t xml:space="preserve">            ValidateName(result.Name);</w:t>
+      </w:r>
+    </w:p>
+    <w:p>
+      <w:pPr>
+        <w:pStyle w:val="Code"/>
+      </w:pPr>
+      <w:r>
+        <w:t xml:space="preserve">            EnsureFile();</w:t>
+      </w:r>
+    </w:p>
+    <w:p>
+      <w:pPr>
+        <w:pStyle w:val="Code"/>
+      </w:pPr>
+      <w:r>
+        <w:t xml:space="preserve">            File.AppendAllText(FilePath, JsonSerializer.Serialize(result) + Environment.NewLine);</w:t>
+      </w:r>
+    </w:p>
+    <w:p>
+      <w:pPr>
+        <w:pStyle w:val="Code"/>
+      </w:pPr>
+      <w:r>
+        <w:t xml:space="preserve">            return true;</w:t>
+      </w:r>
+    </w:p>
+    <w:p>
+      <w:pPr>
+        <w:pStyle w:val="Code"/>
+      </w:pPr>
+      <w:r>
+        <w:t xml:space="preserve">        }</w:t>
+      </w:r>
+    </w:p>
+    <w:p>
+      <w:pPr>
+        <w:pStyle w:val="Code"/>
+      </w:pPr>
+      <w:r>
+        <w:t xml:space="preserve">        catch (Exception e) when (e is IOException or UnauthorizedAccessException) { Fallback(); try { </w:t>
+      </w:r>
+    </w:p>
+    <w:p>
+      <w:pPr>
+        <w:pStyle w:val="Code"/>
+      </w:pPr>
+      <w:r>
+        <w:t xml:space="preserve">EnsureFile(); File.AppendAllText(FilePath, JsonSerializer.Serialize(result) + Environment.NewLine); </w:t>
+      </w:r>
+    </w:p>
+    <w:p>
+      <w:pPr>
+        <w:pStyle w:val="Code"/>
+      </w:pPr>
+      <w:r>
+        <w:t xml:space="preserve">return true; } catch (Exception ex) when (ex is IOException or UnauthorizedAccessException) { </w:t>
+      </w:r>
+    </w:p>
+    <w:p>
+      <w:pPr>
+        <w:pStyle w:val="Code"/>
+      </w:pPr>
+      <w:r>
+        <w:t>warn(LocalizationManager.GetString("LeaderboardSaveFailed")); return false; } }</w:t>
+      </w:r>
+    </w:p>
+    <w:p>
+      <w:pPr>
+        <w:pStyle w:val="Code"/>
+      </w:pPr>
+      <w:r>
+        <w:t xml:space="preserve">    }</w:t>
+      </w:r>
+    </w:p>
+    <w:p>
+      <w:pPr>
+        <w:pStyle w:val="Heading2"/>
+      </w:pPr>
+      <w:r>
+        <w:t>Trích đoạn bổ sung cho vấn đáp</w:t>
+      </w:r>
+    </w:p>
+    <w:p>
+      <w:pPr>
+        <w:pStyle w:val="Heading3"/>
+      </w:pPr>
+      <w:r>
+        <w:t>Điểm vào WinForms</w:t>
+      </w:r>
+    </w:p>
+    <w:p>
+      <w:r>
+        <w:rPr>
+          <w:b w:val="0"/>
+        </w:rPr>
+        <w:t>Nguồn: src/Program.cs</w:t>
+      </w:r>
+    </w:p>
+    <w:p>
+      <w:pPr>
+        <w:pStyle w:val="Code"/>
+      </w:pPr>
+      <w:r>
+        <w:t xml:space="preserve">        LocalizationManager.Initialize();</w:t>
+      </w:r>
+    </w:p>
+    <w:p>
+      <w:pPr>
+        <w:pStyle w:val="Code"/>
+      </w:pPr>
+      <w:r>
+        <w:t xml:space="preserve">        Application.Run(new MainMenuForm());</w:t>
+      </w:r>
+    </w:p>
+    <w:p>
+      <w:pPr>
+        <w:pStyle w:val="Heading3"/>
+      </w:pPr>
+      <w:r>
+        <w:t>Tính điểm</w:t>
+      </w:r>
+    </w:p>
+    <w:p>
+      <w:r>
+        <w:rPr>
+          <w:b w:val="0"/>
+        </w:rPr>
+        <w:t>Nguồn: src/GameLogic/GameManager.cs</w:t>
+      </w:r>
+    </w:p>
+    <w:p>
+      <w:pPr>
+        <w:pStyle w:val="Code"/>
+      </w:pPr>
+      <w:r>
+        <w:t>public static class ScoreManager</w:t>
+      </w:r>
+    </w:p>
+    <w:p>
+      <w:pPr>
+        <w:pStyle w:val="Code"/>
+      </w:pPr>
+      <w:r>
+        <w:t>{</w:t>
+      </w:r>
+    </w:p>
+    <w:p>
+      <w:pPr>
+        <w:pStyle w:val="Code"/>
+      </w:pPr>
+      <w:r>
+        <w:t xml:space="preserve">    public static int Match(int score) =&gt; score + 100;</w:t>
+      </w:r>
+    </w:p>
+    <w:p>
+      <w:pPr>
+        <w:pStyle w:val="Code"/>
+      </w:pPr>
+      <w:r>
+        <w:t xml:space="preserve">    public static int Miss(int score) =&gt; Math.Max(0, score - 10);</w:t>
+      </w:r>
+    </w:p>
+    <w:p>
+      <w:pPr>
+        <w:pStyle w:val="Code"/>
+      </w:pPr>
+      <w:r>
+        <w:t xml:space="preserve">    public static int Victory(int score, int seconds) =&gt; score + seconds * 5;</w:t>
+      </w:r>
+    </w:p>
+    <w:p>
+      <w:pPr>
+        <w:pStyle w:val="Code"/>
+      </w:pPr>
+      <w:r>
+        <w:t>}</w:t>
+      </w:r>
+    </w:p>
+    <w:p>
+      <w:pPr>
+        <w:pStyle w:val="Heading3"/>
+      </w:pPr>
+      <w:r>
+        <w:t>Fisher Yates</w:t>
+      </w:r>
+    </w:p>
+    <w:p>
+      <w:r>
+        <w:rPr>
+          <w:b w:val="0"/>
+        </w:rPr>
+        <w:t>Nguồn: src/GameLogic/GameManager.cs</w:t>
+      </w:r>
+    </w:p>
+    <w:p>
+      <w:pPr>
+        <w:pStyle w:val="Code"/>
+      </w:pPr>
+      <w:r>
+        <w:t xml:space="preserve">        for (int i = Cards.Count - 1; i &gt; 0; i--)</w:t>
+      </w:r>
+    </w:p>
+    <w:p>
+      <w:pPr>
+        <w:pStyle w:val="Code"/>
+      </w:pPr>
+      <w:r>
+        <w:t xml:space="preserve">        {</w:t>
+      </w:r>
+    </w:p>
+    <w:p>
+      <w:pPr>
+        <w:pStyle w:val="Code"/>
+      </w:pPr>
+      <w:r>
+        <w:t xml:space="preserve">            int j = random.Next(i + 1);</w:t>
+      </w:r>
+    </w:p>
+    <w:p>
+      <w:pPr>
+        <w:pStyle w:val="Code"/>
+      </w:pPr>
+      <w:r>
+        <w:t xml:space="preserve">            (Cards[i], Cards[j]) = (Cards[j], Cards[i]);</w:t>
+      </w:r>
+    </w:p>
+    <w:p>
+      <w:pPr>
+        <w:pStyle w:val="Code"/>
+      </w:pPr>
+      <w:r>
+        <w:t xml:space="preserve">        }</w:t>
+      </w:r>
+    </w:p>
+    <w:p>
+      <w:pPr>
+        <w:pStyle w:val="Heading3"/>
+      </w:pPr>
+      <w:r>
+        <w:t>Sinh thẻ và gắn Click</w:t>
+      </w:r>
+    </w:p>
+    <w:p>
+      <w:r>
+        <w:rPr>
+          <w:b w:val="0"/>
+        </w:rPr>
+        <w:t>Nguồn: src/Forms/GameForm.cs</w:t>
+      </w:r>
+    </w:p>
+    <w:p>
+      <w:pPr>
+        <w:pStyle w:val="Code"/>
+      </w:pPr>
+      <w:r>
+        <w:t xml:space="preserve">            int index = i;</w:t>
+      </w:r>
+    </w:p>
+    <w:p>
+      <w:pPr>
+        <w:pStyle w:val="Code"/>
+      </w:pPr>
+      <w:r>
+        <w:t xml:space="preserve">            var card = new MemoryCardControl(Game.Cards[i], </w:t>
+      </w:r>
+    </w:p>
+    <w:p>
+      <w:pPr>
+        <w:pStyle w:val="Code"/>
+      </w:pPr>
+      <w:r>
+        <w:t>resources.LoadImage($"img/{Game.Cards[i].Creature}.png"), back);</w:t>
+      </w:r>
+    </w:p>
+    <w:p>
+      <w:pPr>
+        <w:pStyle w:val="Code"/>
+      </w:pPr>
+      <w:r>
+        <w:t xml:space="preserve">            card.Click += (_, _) =&gt; SelectCard(index);</w:t>
+      </w:r>
+    </w:p>
+    <w:p>
+      <w:pPr>
+        <w:pStyle w:val="Code"/>
+      </w:pPr>
+      <w:r>
+        <w:t xml:space="preserve">            CardControls.Add(card);</w:t>
+      </w:r>
+    </w:p>
+    <w:p>
+      <w:pPr>
+        <w:pStyle w:val="Code"/>
+      </w:pPr>
+      <w:r>
+        <w:t xml:space="preserve">            grid.Controls.Add(card, i % difficulty.Columns, i / difficulty.Columns);</w:t>
+      </w:r>
+    </w:p>
+    <w:p>
+      <w:pPr>
+        <w:pStyle w:val="Heading3"/>
+      </w:pPr>
+      <w:r>
+        <w:t>SoundPlayer và catch</w:t>
+      </w:r>
+    </w:p>
+    <w:p>
+      <w:r>
+        <w:rPr>
+          <w:b w:val="0"/>
+        </w:rPr>
+        <w:t>Nguồn: src/Services/AudioManager.cs</w:t>
+      </w:r>
+    </w:p>
+    <w:p>
+      <w:pPr>
+        <w:pStyle w:val="Code"/>
+      </w:pPr>
+      <w:r>
+        <w:t xml:space="preserve">    private void Play(string file, bool loop = false)</w:t>
+      </w:r>
+    </w:p>
+    <w:p>
+      <w:pPr>
+        <w:pStyle w:val="Code"/>
+      </w:pPr>
+      <w:r>
+        <w:t xml:space="preserve">    {</w:t>
+      </w:r>
+    </w:p>
+    <w:p>
+      <w:pPr>
+        <w:pStyle w:val="Code"/>
+      </w:pPr>
+      <w:r>
+        <w:t xml:space="preserve">        if (!players.TryGetValue(file, out var player))</w:t>
+      </w:r>
+    </w:p>
+    <w:p>
+      <w:pPr>
+        <w:pStyle w:val="Code"/>
+      </w:pPr>
+      <w:r>
+        <w:t xml:space="preserve">            return;</w:t>
+      </w:r>
+    </w:p>
+    <w:p>
+      <w:pPr>
+        <w:pStyle w:val="Code"/>
+      </w:pPr>
+      <w:r>
+        <w:t xml:space="preserve">        try</w:t>
+      </w:r>
+    </w:p>
+    <w:p>
+      <w:pPr>
+        <w:pStyle w:val="Code"/>
+      </w:pPr>
+      <w:r>
+        <w:t xml:space="preserve">        {</w:t>
+      </w:r>
+    </w:p>
+    <w:p>
+      <w:pPr>
+        <w:pStyle w:val="Code"/>
+      </w:pPr>
+      <w:r>
+        <w:t xml:space="preserve">            if (loop)</w:t>
+      </w:r>
+    </w:p>
+    <w:p>
+      <w:pPr>
+        <w:pStyle w:val="Code"/>
+      </w:pPr>
+      <w:r>
+        <w:t xml:space="preserve">                player.PlayLooping();</w:t>
+      </w:r>
+    </w:p>
+    <w:p>
+      <w:pPr>
+        <w:pStyle w:val="Code"/>
+      </w:pPr>
+      <w:r>
+        <w:t xml:space="preserve">            else</w:t>
+      </w:r>
+    </w:p>
+    <w:p>
+      <w:pPr>
+        <w:pStyle w:val="Code"/>
+      </w:pPr>
+      <w:r>
+        <w:t xml:space="preserve">                player.Play();</w:t>
+      </w:r>
+    </w:p>
+    <w:p>
+      <w:pPr>
+        <w:pStyle w:val="Code"/>
+      </w:pPr>
+      <w:r>
+        <w:t xml:space="preserve">        }</w:t>
+      </w:r>
+    </w:p>
+    <w:p>
+      <w:pPr>
+        <w:pStyle w:val="Code"/>
+      </w:pPr>
+      <w:r>
+        <w:t xml:space="preserve">        catch (Exception ex) when (ex is IOException or UnauthorizedAccessException or </w:t>
+      </w:r>
+    </w:p>
+    <w:p>
+      <w:pPr>
+        <w:pStyle w:val="Code"/>
+      </w:pPr>
+      <w:r>
+        <w:t xml:space="preserve">InvalidOperationException or System.ComponentModel.Win32Exception) { </w:t>
+      </w:r>
+    </w:p>
+    <w:p>
+      <w:pPr>
+        <w:pStyle w:val="Code"/>
+      </w:pPr>
+      <w:r>
+        <w:t xml:space="preserve">resources.Warn(LocalizationManager.GetString("AudioPlayFailed", file)); players.Remove(file); </w:t>
+      </w:r>
+    </w:p>
+    <w:p>
+      <w:pPr>
+        <w:pStyle w:val="Code"/>
+      </w:pPr>
+      <w:r>
+        <w:t>player.Dispose(); }</w:t>
+      </w:r>
+    </w:p>
+    <w:p>
+      <w:pPr>
+        <w:pStyle w:val="Code"/>
+      </w:pPr>
+      <w:r>
+        <w:t xml:space="preserve">    }</w:t>
+      </w:r>
+    </w:p>
+    <w:p>
+      <w:pPr>
+        <w:pStyle w:val="Code"/>
+      </w:pPr>
+      <w:r>
+        <w:t xml:space="preserve">    private void Background()</w:t>
+      </w:r>
+    </w:p>
+    <w:p>
+      <w:r>
+        <w:br w:type="page"/>
+      </w:r>
+    </w:p>
+    <w:p>
+      <w:pPr>
+        <w:pStyle w:val="Heading1"/>
+      </w:pPr>
+      <w:r>
+        <w:t>Chương 5 Kiểm thử</w:t>
+      </w:r>
+    </w:p>
+    <w:p>
+      <w:pPr>
+        <w:pStyle w:val="Heading2"/>
+      </w:pPr>
+      <w:r>
+        <w:t>Phương pháp và kết quả</w:t>
+      </w:r>
+    </w:p>
+    <w:p>
+      <w:r>
+        <w:rPr>
+          <w:b w:val="0"/>
+        </w:rPr>
+        <w:t>Bản nâng cấp có 62 PASS: 43 kiểm tra gốc và 19 bổ sung, gồm 15 mã LANG. Selector thật và tiến trình khôi phục mới đã chạy. Đã thử JSON lỗi, tệp bị khóa, đường dẫn không ghi được. Xem LOCALIZATION_RESULTS.txt và ảnh hai ngôn ngữ.</w:t>
+      </w:r>
+    </w:p>
+    <w:p>
+      <w:r>
+        <w:rPr>
+          <w:b w:val="0"/>
+        </w:rPr>
+        <w:t>Build Release có 0 lỗi và 0 cảnh báo. Solution mở trong Visual Studio, title/debug target được quan sát qua accessibility. SelfTests chạy STA, mở form thật, dùng PerformClick đi qua handler, bơm message loop để WinForms Timer thực sự Tick. Application.DoEvents chỉ dùng trong harness kiểm thử. TEST_RESULTS.txt ghi 62 PASS của lần chạy cuối; TEST_PLAN.md có từng bước, mong đợi và thực tế.</w:t>
       </w:r>
     </w:p>
     <w:p>
@@ -2026,9 +2223,6 @@
             <w:tcW w:type="dxa" w:w="3250"/>
           </w:tcPr>
           <w:p>
-            <w:pPr>
-              <w:spacing w:after="100"/>
-            </w:pPr>
             <w:r>
               <w:rPr>
                 <w:sz w:val="18"/>
@@ -2042,9 +2236,6 @@
             <w:tcW w:type="dxa" w:w="3250"/>
           </w:tcPr>
           <w:p>
-            <w:pPr>
-              <w:spacing w:after="100"/>
-            </w:pPr>
             <w:r>
               <w:rPr>
                 <w:sz w:val="18"/>
@@ -2058,9 +2249,6 @@
             <w:tcW w:type="dxa" w:w="3250"/>
           </w:tcPr>
           <w:p>
-            <w:pPr>
-              <w:spacing w:after="100"/>
-            </w:pPr>
             <w:r>
               <w:rPr>
                 <w:sz w:val="18"/>
@@ -2076,9 +2264,6 @@
             <w:tcW w:type="dxa" w:w="3250"/>
           </w:tcPr>
           <w:p>
-            <w:pPr>
-              <w:spacing w:after="100"/>
-            </w:pPr>
             <w:r>
               <w:rPr>
                 <w:sz w:val="18"/>
@@ -2092,9 +2277,6 @@
             <w:tcW w:type="dxa" w:w="3250"/>
           </w:tcPr>
           <w:p>
-            <w:pPr>
-              <w:spacing w:after="100"/>
-            </w:pPr>
             <w:r>
               <w:rPr>
                 <w:sz w:val="18"/>
@@ -2108,9 +2290,6 @@
             <w:tcW w:type="dxa" w:w="3250"/>
           </w:tcPr>
           <w:p>
-            <w:pPr>
-              <w:spacing w:after="100"/>
-            </w:pPr>
             <w:r>
               <w:rPr>
                 <w:sz w:val="18"/>
@@ -2126,9 +2305,6 @@
             <w:tcW w:type="dxa" w:w="3250"/>
           </w:tcPr>
           <w:p>
-            <w:pPr>
-              <w:spacing w:after="100"/>
-            </w:pPr>
             <w:r>
               <w:rPr>
                 <w:sz w:val="18"/>
@@ -2142,9 +2318,6 @@
             <w:tcW w:type="dxa" w:w="3250"/>
           </w:tcPr>
           <w:p>
-            <w:pPr>
-              <w:spacing w:after="100"/>
-            </w:pPr>
             <w:r>
               <w:rPr>
                 <w:sz w:val="18"/>
@@ -2158,9 +2331,6 @@
             <w:tcW w:type="dxa" w:w="3250"/>
           </w:tcPr>
           <w:p>
-            <w:pPr>
-              <w:spacing w:after="100"/>
-            </w:pPr>
             <w:r>
               <w:rPr>
                 <w:sz w:val="18"/>
@@ -2176,9 +2346,6 @@
             <w:tcW w:type="dxa" w:w="3250"/>
           </w:tcPr>
           <w:p>
-            <w:pPr>
-              <w:spacing w:after="100"/>
-            </w:pPr>
             <w:r>
               <w:rPr>
                 <w:sz w:val="18"/>
@@ -2192,9 +2359,6 @@
             <w:tcW w:type="dxa" w:w="3250"/>
           </w:tcPr>
           <w:p>
-            <w:pPr>
-              <w:spacing w:after="100"/>
-            </w:pPr>
             <w:r>
               <w:rPr>
                 <w:sz w:val="18"/>
@@ -2208,9 +2372,6 @@
             <w:tcW w:type="dxa" w:w="3250"/>
           </w:tcPr>
           <w:p>
-            <w:pPr>
-              <w:spacing w:after="100"/>
-            </w:pPr>
             <w:r>
               <w:rPr>
                 <w:sz w:val="18"/>
@@ -2226,9 +2387,6 @@
             <w:tcW w:type="dxa" w:w="3250"/>
           </w:tcPr>
           <w:p>
-            <w:pPr>
-              <w:spacing w:after="100"/>
-            </w:pPr>
             <w:r>
               <w:rPr>
                 <w:sz w:val="18"/>
@@ -2242,9 +2400,6 @@
             <w:tcW w:type="dxa" w:w="3250"/>
           </w:tcPr>
           <w:p>
-            <w:pPr>
-              <w:spacing w:after="100"/>
-            </w:pPr>
             <w:r>
               <w:rPr>
                 <w:sz w:val="18"/>
@@ -2258,9 +2413,6 @@
             <w:tcW w:type="dxa" w:w="3250"/>
           </w:tcPr>
           <w:p>
-            <w:pPr>
-              <w:spacing w:after="100"/>
-            </w:pPr>
             <w:r>
               <w:rPr>
                 <w:sz w:val="18"/>
@@ -2276,9 +2428,6 @@
             <w:tcW w:type="dxa" w:w="3250"/>
           </w:tcPr>
           <w:p>
-            <w:pPr>
-              <w:spacing w:after="100"/>
-            </w:pPr>
             <w:r>
               <w:rPr>
                 <w:sz w:val="18"/>
@@ -2292,9 +2441,6 @@
             <w:tcW w:type="dxa" w:w="3250"/>
           </w:tcPr>
           <w:p>
-            <w:pPr>
-              <w:spacing w:after="100"/>
-            </w:pPr>
             <w:r>
               <w:rPr>
                 <w:sz w:val="18"/>
@@ -2308,9 +2454,6 @@
             <w:tcW w:type="dxa" w:w="3250"/>
           </w:tcPr>
           <w:p>
-            <w:pPr>
-              <w:spacing w:after="100"/>
-            </w:pPr>
             <w:r>
               <w:rPr>
                 <w:sz w:val="18"/>
@@ -2326,9 +2469,6 @@
             <w:tcW w:type="dxa" w:w="3250"/>
           </w:tcPr>
           <w:p>
-            <w:pPr>
-              <w:spacing w:after="100"/>
-            </w:pPr>
             <w:r>
               <w:rPr>
                 <w:sz w:val="18"/>
@@ -2342,9 +2482,6 @@
             <w:tcW w:type="dxa" w:w="3250"/>
           </w:tcPr>
           <w:p>
-            <w:pPr>
-              <w:spacing w:after="100"/>
-            </w:pPr>
             <w:r>
               <w:rPr>
                 <w:sz w:val="18"/>
@@ -2358,9 +2495,6 @@
             <w:tcW w:type="dxa" w:w="3250"/>
           </w:tcPr>
           <w:p>
-            <w:pPr>
-              <w:spacing w:after="100"/>
-            </w:pPr>
             <w:r>
               <w:rPr>
                 <w:sz w:val="18"/>
@@ -2376,9 +2510,6 @@
             <w:tcW w:type="dxa" w:w="3250"/>
           </w:tcPr>
           <w:p>
-            <w:pPr>
-              <w:spacing w:after="100"/>
-            </w:pPr>
             <w:r>
               <w:rPr>
                 <w:sz w:val="18"/>
@@ -2392,9 +2523,6 @@
             <w:tcW w:type="dxa" w:w="3250"/>
           </w:tcPr>
           <w:p>
-            <w:pPr>
-              <w:spacing w:after="100"/>
-            </w:pPr>
             <w:r>
               <w:rPr>
                 <w:sz w:val="18"/>
@@ -2408,9 +2536,6 @@
             <w:tcW w:type="dxa" w:w="3250"/>
           </w:tcPr>
           <w:p>
-            <w:pPr>
-              <w:spacing w:after="100"/>
-            </w:pPr>
             <w:r>
               <w:rPr>
                 <w:sz w:val="18"/>
@@ -2426,9 +2551,6 @@
             <w:tcW w:type="dxa" w:w="3250"/>
           </w:tcPr>
           <w:p>
-            <w:pPr>
-              <w:spacing w:after="100"/>
-            </w:pPr>
             <w:r>
               <w:rPr>
                 <w:sz w:val="18"/>
@@ -2442,9 +2564,6 @@
             <w:tcW w:type="dxa" w:w="3250"/>
           </w:tcPr>
           <w:p>
-            <w:pPr>
-              <w:spacing w:after="100"/>
-            </w:pPr>
             <w:r>
               <w:rPr>
                 <w:sz w:val="18"/>
@@ -2458,9 +2577,6 @@
             <w:tcW w:type="dxa" w:w="3250"/>
           </w:tcPr>
           <w:p>
-            <w:pPr>
-              <w:spacing w:after="100"/>
-            </w:pPr>
             <w:r>
               <w:rPr>
                 <w:sz w:val="18"/>
@@ -2497,6 +2613,22 @@
       </w:r>
     </w:p>
     <w:p>
+      <w:pPr>
+        <w:pStyle w:val="Heading2"/>
+      </w:pPr>
+      <w:r>
+        <w:t>Kết quả kiểm toán chấm điểm</w:t>
+      </w:r>
+    </w:p>
+    <w:p>
+      <w:r>
+        <w:rPr>
+          <w:b w:val="0"/>
+        </w:rPr>
+        <w:t>FINAL_AUDIT.md giữ toàn bộ tiêu chí. Do đề có sai lệch mục con 8 điểm và phần 2 ghi 7 điểm, quy ước ước tính quy đổi phần 2 theo 7/8, tổng 7,7875 ≈ 7,79/10. Đây không phải điểm chính thức; thiếu lớp, video, tiếng nghe được, bẫy lỗi live và vấn đáp nên không chấm tối đa.</w:t>
+      </w:r>
+    </w:p>
+    <w:p>
       <w:r>
         <w:br w:type="page"/>
       </w:r>
@@ -2530,7 +2662,7 @@
         <w:rPr>
           <w:b w:val="0"/>
         </w:rPr>
-        <w:t>Kho công khai được tạo tại https://github.com/NotKioly/Pokemon-Memory-Battle-WinForms. Trạng thái push/remote được ghi trong DELIVERY.md khi bàn giao. Nhóm phải điền thông tin thật, quay video có người nói, nghe thử âm thanh, kiểm tra MessageBox và màn hình/DPI, clone/build trên máy trình bày. Đại diện cần nhập URL vào cột Giữa kì và xác nhận riêng.</w:t>
+        <w:t>Kho công khai được tạo tại https://github.com/NotKioly/Pokemon-Memory-Battle-WinForms. Trạng thái push/remote được ghi trong DELIVERY.md khi bàn giao. Nhóm cần bổ sung lớp và quay video có người nói, nghe thử âm thanh, kiểm tra MessageBox và màn hình/DPI, clone/build trên máy trình bày. Đại diện cần nhập URL vào cột Giữa kì và xác nhận riêng.</w:t>
       </w:r>
     </w:p>
     <w:p>
@@ -2562,7 +2694,7 @@
         <w:rPr>
           <w:b w:val="0"/>
         </w:rPr>
-        <w:t>Có thể thêm lọc xếp hạng theo độ khó, mở rộng bộ sinh vật, animation flip nhẹ và profile người chơi. Cần hoàn thiện minh chứng nộp bài trước tính năng thêm. Sinh viên phải đọc, thử sửa nhỏ và diễn tập code; phân công đề xuất không phải tuyên bố các cá nhân chưa xác định đã thực hiện công việc.</w:t>
+        <w:t>Có thể thêm lọc xếp hạng theo độ khó, mở rộng bộ sinh vật, animation flip nhẹ và profile người chơi. Cần hoàn thiện minh chứng nộp bài trước tính năng thêm. Sinh viên phải đọc, thử sửa nhỏ và diễn tập code; phân công đề xuất không phải tuyên bố từng cá nhân đã thực hiện các phần việc chưa có minh chứng.</w:t>
       </w:r>
     </w:p>
     <w:p>
@@ -2576,14 +2708,6 @@
       </w:pPr>
       <w:r>
         <w:t>Chương 7 Phân công công việc</w:t>
-      </w:r>
-    </w:p>
-    <w:p>
-      <w:pPr>
-        <w:pStyle w:val="Heading2"/>
-      </w:pPr>
-      <w:r>
-        <w:t>Ba thành viên</w:t>
       </w:r>
     </w:p>
     <w:tbl>
@@ -2593,56 +2717,61 @@
         <w:tblLook w:firstColumn="1" w:firstRow="1" w:lastColumn="0" w:lastRow="0" w:noHBand="0" w:noVBand="1" w:val="04A0"/>
       </w:tblPr>
       <w:tblGrid>
-        <w:gridCol w:w="3250"/>
-        <w:gridCol w:w="3250"/>
-        <w:gridCol w:w="3250"/>
+        <w:gridCol w:w="2437"/>
+        <w:gridCol w:w="2437"/>
+        <w:gridCol w:w="2437"/>
+        <w:gridCol w:w="2437"/>
       </w:tblGrid>
       <w:tr>
         <w:tc>
           <w:tcPr>
-            <w:tcW w:type="dxa" w:w="3250"/>
+            <w:tcW w:type="dxa" w:w="2437"/>
           </w:tcPr>
           <w:p>
-            <w:pPr>
-              <w:spacing w:after="100"/>
-            </w:pPr>
             <w:r>
               <w:rPr>
                 <w:sz w:val="18"/>
               </w:rPr>
-              <w:t>Người nhận bàn giao</w:t>
+              <w:t>STT</w:t>
             </w:r>
           </w:p>
         </w:tc>
         <w:tc>
           <w:tcPr>
-            <w:tcW w:type="dxa" w:w="3250"/>
+            <w:tcW w:type="dxa" w:w="2437"/>
           </w:tcPr>
           <w:p>
-            <w:pPr>
-              <w:spacing w:after="100"/>
-            </w:pPr>
             <w:r>
               <w:rPr>
                 <w:sz w:val="18"/>
               </w:rPr>
-              <w:t>Thông tin cần điền</w:t>
+              <w:t>Họ và tên</w:t>
             </w:r>
           </w:p>
         </w:tc>
         <w:tc>
           <w:tcPr>
-            <w:tcW w:type="dxa" w:w="3250"/>
+            <w:tcW w:type="dxa" w:w="2437"/>
           </w:tcPr>
           <w:p>
-            <w:pPr>
-              <w:spacing w:after="100"/>
-            </w:pPr>
             <w:r>
               <w:rPr>
                 <w:sz w:val="18"/>
               </w:rPr>
-              <w:t>Trách nhiệm</w:t>
+              <w:t>MSSV</w:t>
+            </w:r>
+          </w:p>
+        </w:tc>
+        <w:tc>
+          <w:tcPr>
+            <w:tcW w:type="dxa" w:w="2437"/>
+          </w:tcPr>
+          <w:p>
+            <w:r>
+              <w:rPr>
+                <w:sz w:val="18"/>
+              </w:rPr>
+              <w:t>Trách nhiệm dự kiến</w:t>
             </w:r>
           </w:p>
         </w:tc>
@@ -2650,12 +2779,9 @@
       <w:tr>
         <w:tc>
           <w:tcPr>
-            <w:tcW w:type="dxa" w:w="3250"/>
+            <w:tcW w:type="dxa" w:w="2437"/>
           </w:tcPr>
           <w:p>
-            <w:pPr>
-              <w:spacing w:after="100"/>
-            </w:pPr>
             <w:r>
               <w:rPr>
                 <w:sz w:val="18"/>
@@ -2666,33 +2792,40 @@
         </w:tc>
         <w:tc>
           <w:tcPr>
-            <w:tcW w:type="dxa" w:w="3250"/>
+            <w:tcW w:type="dxa" w:w="2437"/>
           </w:tcPr>
           <w:p>
-            <w:pPr>
-              <w:spacing w:after="100"/>
-            </w:pPr>
             <w:r>
               <w:rPr>
                 <w:sz w:val="18"/>
               </w:rPr>
-              <w:t>[HỌ TÊN 1], [MSSV 1], [LỚP 1]</w:t>
+              <w:t>Dương Đình Khôi</w:t>
             </w:r>
           </w:p>
         </w:tc>
         <w:tc>
           <w:tcPr>
-            <w:tcW w:type="dxa" w:w="3250"/>
+            <w:tcW w:type="dxa" w:w="2437"/>
           </w:tcPr>
           <w:p>
-            <w:pPr>
-              <w:spacing w:after="100"/>
-            </w:pPr>
             <w:r>
               <w:rPr>
                 <w:sz w:val="18"/>
               </w:rPr>
-              <w:t>Gameplay, GameManager, điểm, Timer, IO, bắt lỗi</w:t>
+              <w:t>51.01.104.049</w:t>
+            </w:r>
+          </w:p>
+        </w:tc>
+        <w:tc>
+          <w:tcPr>
+            <w:tcW w:type="dxa" w:w="2437"/>
+          </w:tcPr>
+          <w:p>
+            <w:r>
+              <w:rPr>
+                <w:sz w:val="18"/>
+              </w:rPr>
+              <w:t>Lập trình chính; gameplay/logic; Timer/điểm; xử lý lỗi; quản lý source GitHub</w:t>
             </w:r>
           </w:p>
         </w:tc>
@@ -2700,12 +2833,9 @@
       <w:tr>
         <w:tc>
           <w:tcPr>
-            <w:tcW w:type="dxa" w:w="3250"/>
+            <w:tcW w:type="dxa" w:w="2437"/>
           </w:tcPr>
           <w:p>
-            <w:pPr>
-              <w:spacing w:after="100"/>
-            </w:pPr>
             <w:r>
               <w:rPr>
                 <w:sz w:val="18"/>
@@ -2716,33 +2846,40 @@
         </w:tc>
         <w:tc>
           <w:tcPr>
-            <w:tcW w:type="dxa" w:w="3250"/>
+            <w:tcW w:type="dxa" w:w="2437"/>
           </w:tcPr>
           <w:p>
-            <w:pPr>
-              <w:spacing w:after="100"/>
-            </w:pPr>
             <w:r>
               <w:rPr>
                 <w:sz w:val="18"/>
               </w:rPr>
-              <w:t>[HỌ TÊN 2], [MSSV 2], [LỚP 2]</w:t>
+              <w:t>Đào Trọng Quyền</w:t>
             </w:r>
           </w:p>
         </w:tc>
         <w:tc>
           <w:tcPr>
-            <w:tcW w:type="dxa" w:w="3250"/>
+            <w:tcW w:type="dxa" w:w="2437"/>
           </w:tcPr>
           <w:p>
-            <w:pPr>
-              <w:spacing w:after="100"/>
-            </w:pPr>
             <w:r>
               <w:rPr>
                 <w:sz w:val="18"/>
               </w:rPr>
-              <w:t>UI/UX, tài nguyên, hướng dẫn, tài liệu và báo cáo</w:t>
+              <w:t>51.01.104.085</w:t>
+            </w:r>
+          </w:p>
+        </w:tc>
+        <w:tc>
+          <w:tcPr>
+            <w:tcW w:type="dxa" w:w="2437"/>
+          </w:tcPr>
+          <w:p>
+            <w:r>
+              <w:rPr>
+                <w:sz w:val="18"/>
+              </w:rPr>
+              <w:t>UI/UX; tài nguyên; kiểm thử giao diện; hỗ trợ tài liệu kỹ thuật</w:t>
             </w:r>
           </w:p>
         </w:tc>
@@ -2750,12 +2887,9 @@
       <w:tr>
         <w:tc>
           <w:tcPr>
-            <w:tcW w:type="dxa" w:w="3250"/>
+            <w:tcW w:type="dxa" w:w="2437"/>
           </w:tcPr>
           <w:p>
-            <w:pPr>
-              <w:spacing w:after="100"/>
-            </w:pPr>
             <w:r>
               <w:rPr>
                 <w:sz w:val="18"/>
@@ -2766,33 +2900,40 @@
         </w:tc>
         <w:tc>
           <w:tcPr>
-            <w:tcW w:type="dxa" w:w="3250"/>
+            <w:tcW w:type="dxa" w:w="2437"/>
           </w:tcPr>
           <w:p>
-            <w:pPr>
-              <w:spacing w:after="100"/>
-            </w:pPr>
             <w:r>
               <w:rPr>
                 <w:sz w:val="18"/>
               </w:rPr>
-              <w:t>[HỌ TÊN 3], [MSSV 3], [LỚP 3]</w:t>
+              <w:t>Cổ Gia Phúc</w:t>
             </w:r>
           </w:p>
         </w:tc>
         <w:tc>
           <w:tcPr>
-            <w:tcW w:type="dxa" w:w="3250"/>
+            <w:tcW w:type="dxa" w:w="2437"/>
           </w:tcPr>
           <w:p>
-            <w:pPr>
-              <w:spacing w:after="100"/>
-            </w:pPr>
             <w:r>
               <w:rPr>
                 <w:sz w:val="18"/>
               </w:rPr>
-              <w:t>QA, thuyết trình, video thật, GitHub và nộp link</w:t>
+              <w:t>51.01.104.126</w:t>
+            </w:r>
+          </w:p>
+        </w:tc>
+        <w:tc>
+          <w:tcPr>
+            <w:tcW w:type="dxa" w:w="2437"/>
+          </w:tcPr>
+          <w:p>
+            <w:r>
+              <w:rPr>
+                <w:sz w:val="18"/>
+              </w:rPr>
+              <w:t>Thuyết trình; minh họa game; kiểm thử/QA; chuẩn bị báo cáo cuối</w:t>
             </w:r>
           </w:p>
         </w:tc>
@@ -2800,19 +2941,11 @@
     </w:tbl>
     <w:p/>
     <w:p>
-      <w:pPr>
-        <w:pStyle w:val="Heading2"/>
-      </w:pPr>
-      <w:r>
-        <w:t>Nhận bàn giao và diễn tập</w:t>
-      </w:r>
-    </w:p>
-    <w:p>
       <w:r>
         <w:rPr>
           <w:b w:val="0"/>
         </w:rPr>
-        <w:t>Thành viên 1 giải thích Select/Reset/Tick, chạy test, thử thay đổi điểm cộng và xác minh file lưu. Thành viên 2 duyệt bố cục/báo cáo, điền thông tin, giải thích TableLayoutPanel và OnPaint. Thành viên 3 chạy bẫy lỗi ở bản sao output, quay video 3–5 phút, xem lại đủ âm thanh và chữ rồi upload. Mỗi người chuẩn bị Event Handler, System.IO, SoundPlayer, Timer, try/catch và chỉnh sửa nhỏ trực tiếp.</w:t>
+        <w:t>Đây là phân công dự kiến để nhận bàn giao và diễn tập, không xác nhận đóng góp đã hoàn thành. Chưa có lớp, tên trường hay tên giảng viên nên không suy đoán.</w:t>
       </w:r>
     </w:p>
     <w:p>
@@ -2820,15 +2953,7 @@
         <w:rPr>
           <w:b w:val="0"/>
         </w:rPr>
-        <w:t>Kịch bản 10 phút: 0–1 giới thiệu và About; 1–4 gameplay Easy, âm thanh, pause, lưu điểm; 4–7 code và tài nguyên thiếu; 7–10 vấn đáp. DEMO_SCRIPT.md có câu trả lời ngắn; VIDEO_RECORDING.md có checklist và mốc quay. Không dùng slide lý thuyết dài thay live demo.</w:t>
-      </w:r>
-    </w:p>
-    <w:p>
-      <w:pPr>
-        <w:pStyle w:val="Heading2"/>
-      </w:pPr>
-      <w:r>
-        <w:t>Xác nhận trước khi nộp</w:t>
+        <w:t>Khôi cần giải thích GameManager.Select/Reset, GameForm.OnClockTick/OnFlipTick, lưu file và LocalizationManager. Quyền cần trình bày Theme, MemoryCardControl, LocalizedForm.ApplyLocalization, SettingsForm và tài nguyên. Phúc cần nắm SelfTests/LocalizationTests, kết quả kiểm thử, kịch bản, video và báo cáo. Cả ba chuẩn bị Event Handler, Timer, SoundPlayer, System.IO, try/catch và chỉnh sửa nhỏ trực tiếp.</w:t>
       </w:r>
     </w:p>
     <w:p>
@@ -2836,15 +2961,7 @@
         <w:rPr>
           <w:b w:val="0"/>
         </w:rPr>
-        <w:t>Kiểm tra repo public, clone thư mục mới, build/run Easy, lưu tên, mở leaderboard và đổi tên tài nguyên để xác nhận MessageBox. Upload video thật hoặc link Release thật. Điền URL kho vào cột Giữa kì trước 23h59 ngày 27/10/2026 và xác nhận với nhóm. Tất cả mở Visual Studio, thử mic/camera/chia sẻ âm thanh trước khung giờ ít nhất 10 phút.</w:t>
-      </w:r>
-    </w:p>
-    <w:p>
-      <w:r>
-        <w:rPr>
-          <w:b w:val="0"/>
-        </w:rPr>
-        <w:t>Nguồn nội bộ: tài liệu hướng dẫn giảng viên được cung cấp; src; REQUIREMENTS.md; CODE_EXPLANATION.md; TEST_PLAN.md; TEST_RESULTS.txt. Trích đoạn Chương 4 lấy trực tiếp từ source, không đặt tên hàm hoặc lớp giả định.</w:t>
+        <w:t>Ba tên/MSSV khớp AltF4, khung 21:10–21:20 ngày 29/10/2026. Chuẩn bị trước 21:00: mở Visual Studio, thử mic/camera/chia sẻ tiếng, xác nhận lớp thật khi được cung cấp.</w:t>
       </w:r>
     </w:p>
     <w:sectPr>

</xml_diff>